<commit_message>
Rebuild the BRD-01, BRD-03 and BRD-11 sign-off sets v2.0 (00-06) with the retaken screenshots; record names in words in the not found messages read from the code; BRD-12 personas in the BRD-11 role matrix
</commit_message>
<xml_diff>
--- a/docs/deliverables/out/Drop-0_Setup_and_Data_Migration/BRD-03_Product_Maintenance/00_BIBS_StartHere_BRD-03_Product_Maintenance_v2.0.docx
+++ b/docs/deliverables/out/Drop-0_Setup_and_Data_Migration/BRD-03_Product_Maintenance/00_BIBS_StartHere_BRD-03_Product_Maintenance_v2.0.docx
@@ -1707,7 +1707,7 @@
     <w:p>
       <w:r>
         <w:rPr/>
-        <w:t>This pack shows BRD-3 Product Maintenance as built in BIBS on 27-Sep-2026, screen by screen, so that each BDOI business unit can confirm what it will get and sign it off. Product Maintenance is the first set of Drop 0 (Setup and Data Migration): it holds the products, package versions, rates and incentive criteria that New Business, Renewal, Employee Benefits, Submitted Policies, Operations and Accounting use, and the data migration loads its masters at go-live. Signing freezes the content, the screens and the navigation of Product Maintenance; a later change goes through the Change Management Register with its mandays. The screenshots use fictitious seed data only.</w:t>
+        <w:t>This pack shows the proposed BRD-3 Product Maintenance of BIBS, screen by screen, so that each BDOI business unit can confirm what it will get and sign it off. Product Maintenance is the first set of Drop 0 (Setup and Data Migration): it holds the products, package versions, rates and incentive criteria that New Business, Renewal, Employee Benefits, Submitted Policies, Operations and Accounting use, and the data migration loads its masters at go-live. Signing freezes the content, the screens and the navigation of Product Maintenance; a later change goes through the Change Management Register with its mandays. The screenshots use fictitious seed data only.</w:t>
       </w:r>
     </w:p>
     <w:p>
@@ -2678,7 +2678,7 @@
               <w:rPr>
                 <w:sz w:val="16"/>
               </w:rPr>
-              <w:t>00 Start Here; 01 Guide deck; FRS chapters 1-3 (context and personas), 10.4 (differences from the BRD), 14 (walkthroughs), 19 (configuration inputs) and 21 (sign-off); workbook Sign-off certificate</w:t>
+              <w:t>00 Start Here; 01 Guide deck; FRS chapters 1-3 (context and personas), 22 (proposed rules for confirmation), 14 (walkthroughs), 19 (configuration inputs) and 21 (sign-off); workbook Sign-off certificate</w:t>
             </w:r>
           </w:p>
         </w:tc>
@@ -3603,7 +3603,7 @@
               <w:rPr>
                 <w:sz w:val="15"/>
               </w:rPr>
-              <w:t>One consolidated comments log, each item typed (clarification, defect, change request) and answered; Q&amp;A minutes</w:t>
+              <w:t>One consolidated comments log, each item typed (clarification, correction, change request) and answered; Q&amp;A minutes</w:t>
             </w:r>
           </w:p>
         </w:tc>
@@ -3901,7 +3901,7 @@
               <w:rPr>
                 <w:sz w:val="15"/>
               </w:rPr>
-              <w:t>Handover to development or build freeze; configuration and migration inputs</w:t>
+              <w:t>Content freeze; configuration and migration inputs</w:t>
             </w:r>
           </w:p>
         </w:tc>
@@ -3945,7 +3945,7 @@
               <w:rPr>
                 <w:sz w:val="15"/>
               </w:rPr>
-              <w:t>Build frozen as signed; approved deltas scheduled in the Change Management Register; templates handed to the data migration mocks</w:t>
+              <w:t>Content frozen as signed; approved deltas scheduled in the Change Management Register; templates handed to the data migration mocks</w:t>
             </w:r>
           </w:p>
         </w:tc>

</xml_diff>

<commit_message>
Rebuild the issued sign-off sets BRD-01, BRD-03, BRD-11, BRD-13 (files 00 to 05/06) and the Drop 0 closure set v2.0 with the business wording and Who signs what; the placement channel message as the platform shows it; the legacy record status list in the Drop 0 inputs map
</commit_message>
<xml_diff>
--- a/docs/deliverables/out/Drop-0_Setup_and_Data_Migration/BRD-03_Product_Maintenance/00_BIBS_StartHere_BRD-03_Product_Maintenance_v2.0.docx
+++ b/docs/deliverables/out/Drop-0_Setup_and_Data_Migration/BRD-03_Product_Maintenance/00_BIBS_StartHere_BRD-03_Product_Maintenance_v2.0.docx
@@ -1660,7 +1660,7 @@
       </w:pPr>
       <w:hyperlink w:anchor="_Toc000105" w:history="1">
         <w:r>
-          <w:t xml:space="preserve">5 Configuration inputs</w:t>
+          <w:t xml:space="preserve">5 Who signs what</w:t>
         </w:r>
         <w:r>
           <w:t xml:space="preserve">	</w:t>
@@ -1676,13 +1676,29 @@
       </w:pPr>
       <w:hyperlink w:anchor="_Toc000106" w:history="1">
         <w:r>
-          <w:t xml:space="preserve">6 Change control after sign-off</w:t>
+          <w:t xml:space="preserve">6 Configuration inputs</w:t>
         </w:r>
         <w:r>
           <w:t xml:space="preserve">	</w:t>
         </w:r>
         <w:r>
-          <w:t xml:space="preserve">6</w:t>
+          <w:t xml:space="preserve">7</w:t>
+        </w:r>
+      </w:hyperlink>
+    </w:p>
+    <w:p>
+      <w:pPr>
+        <w:pStyle w:val="toc1"/>
+      </w:pPr>
+      <w:hyperlink w:anchor="_Toc000107" w:history="1">
+        <w:r>
+          <w:t xml:space="preserve">7 Change control after sign-off</w:t>
+        </w:r>
+        <w:r>
+          <w:t xml:space="preserve">	</w:t>
+        </w:r>
+        <w:r>
+          <w:t xml:space="preserve">7</w:t>
         </w:r>
       </w:hyperlink>
       <w:r>
@@ -4555,9 +4571,2631 @@
       <w:bookmarkStart w:id="105" w:name="_Toc000105"/>
       <w:r>
         <w:rPr/>
-        <w:t>5 Configuration inputs</w:t>
+        <w:t>5 Who signs what</w:t>
       </w:r>
       <w:bookmarkEnd w:id="105"/>
+    </w:p>
+    <w:p>
+      <w:r>
+        <w:rPr/>
+        <w:t>The set holds business content only: the screens and fields, the columns of the lists, reports and templates that the user sees or fills in, the validations, business rules, messages, notifications, documents, walkthroughs and reports. The business users sign that content. Technical content (the interfaces between systems, data storage, security set-up) is not part of the set: it is in the Technical Specification, a separate document reviewed by BDOI IT. The roles are those of the approval sheet of the BRD: iorta TechNXT prepares the set, the business units provide the input and review their parts, BDOI IT reviews the interfaces, the user access and the Technical Specification, the Program Manager of Business Project Services reviews the traceability and the completeness, and the Product Owner approves the whole set.</w:t>
+      </w:r>
+    </w:p>
+    <w:p>
+      <w:pPr>
+        <w:pStyle w:val="Caption"/>
+        <w:keepNext/>
+        <w:spacing w:after="60"/>
+      </w:pPr>
+      <w:r>
+        <w:rPr>
+          <w:b/>
+          <w:i w:val="0"/>
+        </w:rPr>
+        <w:t xml:space="preserve">Table 5: </w:t>
+      </w:r>
+      <w:r>
+        <w:rPr/>
+        <w:t>Who signs what: responsibility per part of the set</w:t>
+      </w:r>
+    </w:p>
+    <w:tbl>
+      <w:tblPr>
+        <w:tblW w:type="dxa" w:w="9973"/>
+        <w:jc w:val="center"/>
+        <w:tblLook w:firstColumn="1" w:firstRow="1" w:lastColumn="0" w:lastRow="0" w:noHBand="0" w:noVBand="1" w:val="04A0"/>
+        <w:tblBorders>
+          <w:top w:val="single" w:sz="4" w:space="0" w:color="C2C2C1"/>
+          <w:left w:val="single" w:sz="4" w:space="0" w:color="C2C2C1"/>
+          <w:bottom w:val="single" w:sz="4" w:space="0" w:color="C2C2C1"/>
+          <w:right w:val="single" w:sz="4" w:space="0" w:color="C2C2C1"/>
+          <w:insideH w:val="single" w:sz="4" w:space="0" w:color="C2C2C1"/>
+          <w:insideV w:val="single" w:sz="4" w:space="0" w:color="C2C2C1"/>
+        </w:tblBorders>
+        <w:tblLayout w:type="fixed"/>
+      </w:tblPr>
+      <w:tblGrid>
+        <w:gridCol w:w="2946"/>
+        <w:gridCol w:w="1359"/>
+        <w:gridCol w:w="1813"/>
+        <w:gridCol w:w="1699"/>
+        <w:gridCol w:w="2153"/>
+      </w:tblGrid>
+      <w:tr>
+        <w:trPr>
+          <w:tblHeader w:val="true"/>
+          <w:cantSplit w:val="true"/>
+        </w:trPr>
+        <w:tc>
+          <w:tcPr>
+            <w:tcW w:type="dxa" w:w="2946"/>
+            <w:shd w:val="clear" w:color="auto" w:fill="004EA8"/>
+            <w:tcMar>
+              <w:top w:w="50" w:type="dxa"/>
+              <w:bottom w:w="50" w:type="dxa"/>
+              <w:left w:w="90" w:type="dxa"/>
+              <w:right w:w="90" w:type="dxa"/>
+            </w:tcMar>
+            <w:vAlign w:val="center"/>
+          </w:tcPr>
+          <w:p>
+            <w:pPr>
+              <w:pStyle w:val="BDOITableHeader"/>
+            </w:pPr>
+            <w:r>
+              <w:rPr>
+                <w:b/>
+                <w:color w:val="FFFFFF"/>
+                <w:sz w:val="15"/>
+              </w:rPr>
+              <w:t>Part of the set</w:t>
+            </w:r>
+          </w:p>
+        </w:tc>
+        <w:tc>
+          <w:tcPr>
+            <w:tcW w:type="dxa" w:w="1360"/>
+            <w:shd w:val="clear" w:color="auto" w:fill="004EA8"/>
+            <w:tcMar>
+              <w:top w:w="50" w:type="dxa"/>
+              <w:bottom w:w="50" w:type="dxa"/>
+              <w:left w:w="90" w:type="dxa"/>
+              <w:right w:w="90" w:type="dxa"/>
+            </w:tcMar>
+            <w:vAlign w:val="center"/>
+          </w:tcPr>
+          <w:p>
+            <w:pPr>
+              <w:pStyle w:val="BDOITableHeader"/>
+            </w:pPr>
+            <w:r>
+              <w:rPr>
+                <w:b/>
+                <w:color w:val="FFFFFF"/>
+                <w:sz w:val="15"/>
+              </w:rPr>
+              <w:t>Prepares</w:t>
+            </w:r>
+          </w:p>
+        </w:tc>
+        <w:tc>
+          <w:tcPr>
+            <w:tcW w:type="dxa" w:w="1813"/>
+            <w:shd w:val="clear" w:color="auto" w:fill="004EA8"/>
+            <w:tcMar>
+              <w:top w:w="50" w:type="dxa"/>
+              <w:bottom w:w="50" w:type="dxa"/>
+              <w:left w:w="90" w:type="dxa"/>
+              <w:right w:w="90" w:type="dxa"/>
+            </w:tcMar>
+            <w:vAlign w:val="center"/>
+          </w:tcPr>
+          <w:p>
+            <w:pPr>
+              <w:pStyle w:val="BDOITableHeader"/>
+            </w:pPr>
+            <w:r>
+              <w:rPr>
+                <w:b/>
+                <w:color w:val="FFFFFF"/>
+                <w:sz w:val="15"/>
+              </w:rPr>
+              <w:t>Provides input</w:t>
+            </w:r>
+          </w:p>
+        </w:tc>
+        <w:tc>
+          <w:tcPr>
+            <w:tcW w:type="dxa" w:w="1700"/>
+            <w:shd w:val="clear" w:color="auto" w:fill="004EA8"/>
+            <w:tcMar>
+              <w:top w:w="50" w:type="dxa"/>
+              <w:bottom w:w="50" w:type="dxa"/>
+              <w:left w:w="90" w:type="dxa"/>
+              <w:right w:w="90" w:type="dxa"/>
+            </w:tcMar>
+            <w:vAlign w:val="center"/>
+          </w:tcPr>
+          <w:p>
+            <w:pPr>
+              <w:pStyle w:val="BDOITableHeader"/>
+            </w:pPr>
+            <w:r>
+              <w:rPr>
+                <w:b/>
+                <w:color w:val="FFFFFF"/>
+                <w:sz w:val="15"/>
+              </w:rPr>
+              <w:t>Reviews</w:t>
+            </w:r>
+          </w:p>
+        </w:tc>
+        <w:tc>
+          <w:tcPr>
+            <w:tcW w:type="dxa" w:w="2153"/>
+            <w:shd w:val="clear" w:color="auto" w:fill="004EA8"/>
+            <w:tcMar>
+              <w:top w:w="50" w:type="dxa"/>
+              <w:bottom w:w="50" w:type="dxa"/>
+              <w:left w:w="90" w:type="dxa"/>
+              <w:right w:w="90" w:type="dxa"/>
+            </w:tcMar>
+            <w:vAlign w:val="center"/>
+          </w:tcPr>
+          <w:p>
+            <w:pPr>
+              <w:pStyle w:val="BDOITableHeader"/>
+            </w:pPr>
+            <w:r>
+              <w:rPr>
+                <w:b/>
+                <w:color w:val="FFFFFF"/>
+                <w:sz w:val="15"/>
+              </w:rPr>
+              <w:t>Approves</w:t>
+            </w:r>
+          </w:p>
+        </w:tc>
+      </w:tr>
+      <w:tr>
+        <w:tc>
+          <w:tcPr>
+            <w:tcW w:type="dxa" w:w="2946"/>
+            <w:tcMar>
+              <w:top w:w="50" w:type="dxa"/>
+              <w:bottom w:w="50" w:type="dxa"/>
+              <w:left w:w="90" w:type="dxa"/>
+              <w:right w:w="90" w:type="dxa"/>
+            </w:tcMar>
+          </w:tcPr>
+          <w:p>
+            <w:pPr>
+              <w:pStyle w:val="BDOITable"/>
+            </w:pPr>
+            <w:r>
+              <w:rPr>
+                <w:b/>
+                <w:sz w:val="15"/>
+              </w:rPr>
+              <w:t>Screens and fields (FRS screen specifications; workbook Screen catalogue, Field register)</w:t>
+            </w:r>
+          </w:p>
+        </w:tc>
+        <w:tc>
+          <w:tcPr>
+            <w:tcW w:type="dxa" w:w="1360"/>
+            <w:tcMar>
+              <w:top w:w="50" w:type="dxa"/>
+              <w:bottom w:w="50" w:type="dxa"/>
+              <w:left w:w="90" w:type="dxa"/>
+              <w:right w:w="90" w:type="dxa"/>
+            </w:tcMar>
+          </w:tcPr>
+          <w:p>
+            <w:pPr>
+              <w:pStyle w:val="BDOITable"/>
+            </w:pPr>
+            <w:r>
+              <w:rPr>
+                <w:sz w:val="15"/>
+              </w:rPr>
+              <w:t>iorta TechNXT</w:t>
+            </w:r>
+          </w:p>
+        </w:tc>
+        <w:tc>
+          <w:tcPr>
+            <w:tcW w:type="dxa" w:w="1813"/>
+            <w:tcMar>
+              <w:top w:w="50" w:type="dxa"/>
+              <w:bottom w:w="50" w:type="dxa"/>
+              <w:left w:w="90" w:type="dxa"/>
+              <w:right w:w="90" w:type="dxa"/>
+            </w:tcMar>
+          </w:tcPr>
+          <w:p>
+            <w:pPr>
+              <w:pStyle w:val="BDOITable"/>
+            </w:pPr>
+            <w:r>
+              <w:rPr>
+                <w:sz w:val="15"/>
+              </w:rPr>
+              <w:t>TSU, MBS</w:t>
+            </w:r>
+          </w:p>
+        </w:tc>
+        <w:tc>
+          <w:tcPr>
+            <w:tcW w:type="dxa" w:w="1700"/>
+            <w:tcMar>
+              <w:top w:w="50" w:type="dxa"/>
+              <w:bottom w:w="50" w:type="dxa"/>
+              <w:left w:w="90" w:type="dxa"/>
+              <w:right w:w="90" w:type="dxa"/>
+            </w:tcMar>
+          </w:tcPr>
+          <w:p>
+            <w:pPr>
+              <w:pStyle w:val="BDOITable"/>
+            </w:pPr>
+            <w:r>
+              <w:rPr>
+                <w:sz w:val="15"/>
+              </w:rPr>
+              <w:t>MBS, Program Manager (BPS)</w:t>
+            </w:r>
+          </w:p>
+        </w:tc>
+        <w:tc>
+          <w:tcPr>
+            <w:tcW w:type="dxa" w:w="2153"/>
+            <w:tcMar>
+              <w:top w:w="50" w:type="dxa"/>
+              <w:bottom w:w="50" w:type="dxa"/>
+              <w:left w:w="90" w:type="dxa"/>
+              <w:right w:w="90" w:type="dxa"/>
+            </w:tcMar>
+          </w:tcPr>
+          <w:p>
+            <w:pPr>
+              <w:pStyle w:val="BDOITable"/>
+            </w:pPr>
+            <w:r>
+              <w:rPr>
+                <w:sz w:val="15"/>
+              </w:rPr>
+              <w:t>Product Owner, UH Claims and TU, UH Combank and Corbank, Head Retail Marketing, Head Corporate and Retail Marketing</w:t>
+            </w:r>
+          </w:p>
+        </w:tc>
+      </w:tr>
+      <w:tr>
+        <w:tc>
+          <w:tcPr>
+            <w:tcW w:type="dxa" w:w="2946"/>
+            <w:tcMar>
+              <w:top w:w="50" w:type="dxa"/>
+              <w:bottom w:w="50" w:type="dxa"/>
+              <w:left w:w="90" w:type="dxa"/>
+              <w:right w:w="90" w:type="dxa"/>
+            </w:tcMar>
+            <w:shd w:val="clear" w:color="auto" w:fill="E5F5FF"/>
+          </w:tcPr>
+          <w:p>
+            <w:pPr>
+              <w:pStyle w:val="BDOITable"/>
+            </w:pPr>
+            <w:r>
+              <w:rPr>
+                <w:b/>
+                <w:sz w:val="15"/>
+              </w:rPr>
+              <w:t>Business rules and validations</w:t>
+            </w:r>
+          </w:p>
+        </w:tc>
+        <w:tc>
+          <w:tcPr>
+            <w:tcW w:type="dxa" w:w="1360"/>
+            <w:tcMar>
+              <w:top w:w="50" w:type="dxa"/>
+              <w:bottom w:w="50" w:type="dxa"/>
+              <w:left w:w="90" w:type="dxa"/>
+              <w:right w:w="90" w:type="dxa"/>
+            </w:tcMar>
+            <w:shd w:val="clear" w:color="auto" w:fill="E5F5FF"/>
+          </w:tcPr>
+          <w:p>
+            <w:pPr>
+              <w:pStyle w:val="BDOITable"/>
+            </w:pPr>
+            <w:r>
+              <w:rPr>
+                <w:sz w:val="15"/>
+              </w:rPr>
+              <w:t>iorta TechNXT</w:t>
+            </w:r>
+          </w:p>
+        </w:tc>
+        <w:tc>
+          <w:tcPr>
+            <w:tcW w:type="dxa" w:w="1813"/>
+            <w:tcMar>
+              <w:top w:w="50" w:type="dxa"/>
+              <w:bottom w:w="50" w:type="dxa"/>
+              <w:left w:w="90" w:type="dxa"/>
+              <w:right w:w="90" w:type="dxa"/>
+            </w:tcMar>
+            <w:shd w:val="clear" w:color="auto" w:fill="E5F5FF"/>
+          </w:tcPr>
+          <w:p>
+            <w:pPr>
+              <w:pStyle w:val="BDOITable"/>
+            </w:pPr>
+            <w:r>
+              <w:rPr>
+                <w:sz w:val="15"/>
+              </w:rPr>
+              <w:t>TSU, MBS, BA (BPS)</w:t>
+            </w:r>
+          </w:p>
+        </w:tc>
+        <w:tc>
+          <w:tcPr>
+            <w:tcW w:type="dxa" w:w="1700"/>
+            <w:tcMar>
+              <w:top w:w="50" w:type="dxa"/>
+              <w:bottom w:w="50" w:type="dxa"/>
+              <w:left w:w="90" w:type="dxa"/>
+              <w:right w:w="90" w:type="dxa"/>
+            </w:tcMar>
+            <w:shd w:val="clear" w:color="auto" w:fill="E5F5FF"/>
+          </w:tcPr>
+          <w:p>
+            <w:pPr>
+              <w:pStyle w:val="BDOITable"/>
+            </w:pPr>
+            <w:r>
+              <w:rPr>
+                <w:sz w:val="15"/>
+              </w:rPr>
+              <w:t>MBS, Program Manager (BPS)</w:t>
+            </w:r>
+          </w:p>
+        </w:tc>
+        <w:tc>
+          <w:tcPr>
+            <w:tcW w:type="dxa" w:w="2153"/>
+            <w:tcMar>
+              <w:top w:w="50" w:type="dxa"/>
+              <w:bottom w:w="50" w:type="dxa"/>
+              <w:left w:w="90" w:type="dxa"/>
+              <w:right w:w="90" w:type="dxa"/>
+            </w:tcMar>
+            <w:shd w:val="clear" w:color="auto" w:fill="E5F5FF"/>
+          </w:tcPr>
+          <w:p>
+            <w:pPr>
+              <w:pStyle w:val="BDOITable"/>
+            </w:pPr>
+            <w:r>
+              <w:rPr>
+                <w:sz w:val="15"/>
+              </w:rPr>
+              <w:t>Product Owner, UH Claims and TU, Head Comptrollership</w:t>
+            </w:r>
+          </w:p>
+        </w:tc>
+      </w:tr>
+      <w:tr>
+        <w:tc>
+          <w:tcPr>
+            <w:tcW w:type="dxa" w:w="2946"/>
+            <w:tcMar>
+              <w:top w:w="50" w:type="dxa"/>
+              <w:bottom w:w="50" w:type="dxa"/>
+              <w:left w:w="90" w:type="dxa"/>
+              <w:right w:w="90" w:type="dxa"/>
+            </w:tcMar>
+          </w:tcPr>
+          <w:p>
+            <w:pPr>
+              <w:pStyle w:val="BDOITable"/>
+            </w:pPr>
+            <w:r>
+              <w:rPr>
+                <w:b/>
+                <w:sz w:val="15"/>
+              </w:rPr>
+              <w:t>Messages and notifications</w:t>
+            </w:r>
+          </w:p>
+        </w:tc>
+        <w:tc>
+          <w:tcPr>
+            <w:tcW w:type="dxa" w:w="1360"/>
+            <w:tcMar>
+              <w:top w:w="50" w:type="dxa"/>
+              <w:bottom w:w="50" w:type="dxa"/>
+              <w:left w:w="90" w:type="dxa"/>
+              <w:right w:w="90" w:type="dxa"/>
+            </w:tcMar>
+          </w:tcPr>
+          <w:p>
+            <w:pPr>
+              <w:pStyle w:val="BDOITable"/>
+            </w:pPr>
+            <w:r>
+              <w:rPr>
+                <w:sz w:val="15"/>
+              </w:rPr>
+              <w:t>iorta TechNXT</w:t>
+            </w:r>
+          </w:p>
+        </w:tc>
+        <w:tc>
+          <w:tcPr>
+            <w:tcW w:type="dxa" w:w="1813"/>
+            <w:tcMar>
+              <w:top w:w="50" w:type="dxa"/>
+              <w:bottom w:w="50" w:type="dxa"/>
+              <w:left w:w="90" w:type="dxa"/>
+              <w:right w:w="90" w:type="dxa"/>
+            </w:tcMar>
+          </w:tcPr>
+          <w:p>
+            <w:pPr>
+              <w:pStyle w:val="BDOITable"/>
+            </w:pPr>
+            <w:r>
+              <w:rPr>
+                <w:sz w:val="15"/>
+              </w:rPr>
+              <w:t>TSU, MBS</w:t>
+            </w:r>
+          </w:p>
+        </w:tc>
+        <w:tc>
+          <w:tcPr>
+            <w:tcW w:type="dxa" w:w="1700"/>
+            <w:tcMar>
+              <w:top w:w="50" w:type="dxa"/>
+              <w:bottom w:w="50" w:type="dxa"/>
+              <w:left w:w="90" w:type="dxa"/>
+              <w:right w:w="90" w:type="dxa"/>
+            </w:tcMar>
+          </w:tcPr>
+          <w:p>
+            <w:pPr>
+              <w:pStyle w:val="BDOITable"/>
+            </w:pPr>
+            <w:r>
+              <w:rPr>
+                <w:sz w:val="15"/>
+              </w:rPr>
+              <w:t>Program Manager (BPS)</w:t>
+            </w:r>
+          </w:p>
+        </w:tc>
+        <w:tc>
+          <w:tcPr>
+            <w:tcW w:type="dxa" w:w="2153"/>
+            <w:tcMar>
+              <w:top w:w="50" w:type="dxa"/>
+              <w:bottom w:w="50" w:type="dxa"/>
+              <w:left w:w="90" w:type="dxa"/>
+              <w:right w:w="90" w:type="dxa"/>
+            </w:tcMar>
+          </w:tcPr>
+          <w:p>
+            <w:pPr>
+              <w:pStyle w:val="BDOITable"/>
+            </w:pPr>
+            <w:r>
+              <w:rPr>
+                <w:sz w:val="15"/>
+              </w:rPr>
+              <w:t>Product Owner</w:t>
+            </w:r>
+          </w:p>
+        </w:tc>
+      </w:tr>
+      <w:tr>
+        <w:tc>
+          <w:tcPr>
+            <w:tcW w:type="dxa" w:w="2946"/>
+            <w:tcMar>
+              <w:top w:w="50" w:type="dxa"/>
+              <w:bottom w:w="50" w:type="dxa"/>
+              <w:left w:w="90" w:type="dxa"/>
+              <w:right w:w="90" w:type="dxa"/>
+            </w:tcMar>
+            <w:shd w:val="clear" w:color="auto" w:fill="E5F5FF"/>
+          </w:tcPr>
+          <w:p>
+            <w:pPr>
+              <w:pStyle w:val="BDOITable"/>
+            </w:pPr>
+            <w:r>
+              <w:rPr>
+                <w:b/>
+                <w:sz w:val="15"/>
+              </w:rPr>
+              <w:t>Documents and reports (quotation slip, comparative, advisories, catalogue reports)</w:t>
+            </w:r>
+          </w:p>
+        </w:tc>
+        <w:tc>
+          <w:tcPr>
+            <w:tcW w:type="dxa" w:w="1360"/>
+            <w:tcMar>
+              <w:top w:w="50" w:type="dxa"/>
+              <w:bottom w:w="50" w:type="dxa"/>
+              <w:left w:w="90" w:type="dxa"/>
+              <w:right w:w="90" w:type="dxa"/>
+            </w:tcMar>
+            <w:shd w:val="clear" w:color="auto" w:fill="E5F5FF"/>
+          </w:tcPr>
+          <w:p>
+            <w:pPr>
+              <w:pStyle w:val="BDOITable"/>
+            </w:pPr>
+            <w:r>
+              <w:rPr>
+                <w:sz w:val="15"/>
+              </w:rPr>
+              <w:t>iorta TechNXT</w:t>
+            </w:r>
+          </w:p>
+        </w:tc>
+        <w:tc>
+          <w:tcPr>
+            <w:tcW w:type="dxa" w:w="1813"/>
+            <w:tcMar>
+              <w:top w:w="50" w:type="dxa"/>
+              <w:bottom w:w="50" w:type="dxa"/>
+              <w:left w:w="90" w:type="dxa"/>
+              <w:right w:w="90" w:type="dxa"/>
+            </w:tcMar>
+            <w:shd w:val="clear" w:color="auto" w:fill="E5F5FF"/>
+          </w:tcPr>
+          <w:p>
+            <w:pPr>
+              <w:pStyle w:val="BDOITable"/>
+            </w:pPr>
+            <w:r>
+              <w:rPr>
+                <w:sz w:val="15"/>
+              </w:rPr>
+              <w:t>TSU, MBS</w:t>
+            </w:r>
+          </w:p>
+        </w:tc>
+        <w:tc>
+          <w:tcPr>
+            <w:tcW w:type="dxa" w:w="1700"/>
+            <w:tcMar>
+              <w:top w:w="50" w:type="dxa"/>
+              <w:bottom w:w="50" w:type="dxa"/>
+              <w:left w:w="90" w:type="dxa"/>
+              <w:right w:w="90" w:type="dxa"/>
+            </w:tcMar>
+            <w:shd w:val="clear" w:color="auto" w:fill="E5F5FF"/>
+          </w:tcPr>
+          <w:p>
+            <w:pPr>
+              <w:pStyle w:val="BDOITable"/>
+            </w:pPr>
+            <w:r>
+              <w:rPr>
+                <w:sz w:val="15"/>
+              </w:rPr>
+              <w:t>Program Manager (BPS)</w:t>
+            </w:r>
+          </w:p>
+        </w:tc>
+        <w:tc>
+          <w:tcPr>
+            <w:tcW w:type="dxa" w:w="2153"/>
+            <w:tcMar>
+              <w:top w:w="50" w:type="dxa"/>
+              <w:bottom w:w="50" w:type="dxa"/>
+              <w:left w:w="90" w:type="dxa"/>
+              <w:right w:w="90" w:type="dxa"/>
+            </w:tcMar>
+            <w:shd w:val="clear" w:color="auto" w:fill="E5F5FF"/>
+          </w:tcPr>
+          <w:p>
+            <w:pPr>
+              <w:pStyle w:val="BDOITable"/>
+            </w:pPr>
+            <w:r>
+              <w:rPr>
+                <w:sz w:val="15"/>
+              </w:rPr>
+              <w:t>Product Owner, UH Claims and TU</w:t>
+            </w:r>
+          </w:p>
+        </w:tc>
+      </w:tr>
+      <w:tr>
+        <w:tc>
+          <w:tcPr>
+            <w:tcW w:type="dxa" w:w="2946"/>
+            <w:tcMar>
+              <w:top w:w="50" w:type="dxa"/>
+              <w:bottom w:w="50" w:type="dxa"/>
+              <w:left w:w="90" w:type="dxa"/>
+              <w:right w:w="90" w:type="dxa"/>
+            </w:tcMar>
+          </w:tcPr>
+          <w:p>
+            <w:pPr>
+              <w:pStyle w:val="BDOITable"/>
+            </w:pPr>
+            <w:r>
+              <w:rPr>
+                <w:b/>
+                <w:sz w:val="15"/>
+              </w:rPr>
+              <w:t>Walkthroughs (end-to-end, screen by screen)</w:t>
+            </w:r>
+          </w:p>
+        </w:tc>
+        <w:tc>
+          <w:tcPr>
+            <w:tcW w:type="dxa" w:w="1360"/>
+            <w:tcMar>
+              <w:top w:w="50" w:type="dxa"/>
+              <w:bottom w:w="50" w:type="dxa"/>
+              <w:left w:w="90" w:type="dxa"/>
+              <w:right w:w="90" w:type="dxa"/>
+            </w:tcMar>
+          </w:tcPr>
+          <w:p>
+            <w:pPr>
+              <w:pStyle w:val="BDOITable"/>
+            </w:pPr>
+            <w:r>
+              <w:rPr>
+                <w:sz w:val="15"/>
+              </w:rPr>
+              <w:t>iorta TechNXT</w:t>
+            </w:r>
+          </w:p>
+        </w:tc>
+        <w:tc>
+          <w:tcPr>
+            <w:tcW w:type="dxa" w:w="1813"/>
+            <w:tcMar>
+              <w:top w:w="50" w:type="dxa"/>
+              <w:bottom w:w="50" w:type="dxa"/>
+              <w:left w:w="90" w:type="dxa"/>
+              <w:right w:w="90" w:type="dxa"/>
+            </w:tcMar>
+          </w:tcPr>
+          <w:p>
+            <w:pPr>
+              <w:pStyle w:val="BDOITable"/>
+            </w:pPr>
+            <w:r>
+              <w:rPr>
+                <w:sz w:val="15"/>
+              </w:rPr>
+              <w:t>TSU, MBS</w:t>
+            </w:r>
+          </w:p>
+        </w:tc>
+        <w:tc>
+          <w:tcPr>
+            <w:tcW w:type="dxa" w:w="1700"/>
+            <w:tcMar>
+              <w:top w:w="50" w:type="dxa"/>
+              <w:bottom w:w="50" w:type="dxa"/>
+              <w:left w:w="90" w:type="dxa"/>
+              <w:right w:w="90" w:type="dxa"/>
+            </w:tcMar>
+          </w:tcPr>
+          <w:p>
+            <w:pPr>
+              <w:pStyle w:val="BDOITable"/>
+            </w:pPr>
+            <w:r>
+              <w:rPr>
+                <w:sz w:val="15"/>
+              </w:rPr>
+              <w:t>Program Manager (BPS)</w:t>
+            </w:r>
+          </w:p>
+        </w:tc>
+        <w:tc>
+          <w:tcPr>
+            <w:tcW w:type="dxa" w:w="2153"/>
+            <w:tcMar>
+              <w:top w:w="50" w:type="dxa"/>
+              <w:bottom w:w="50" w:type="dxa"/>
+              <w:left w:w="90" w:type="dxa"/>
+              <w:right w:w="90" w:type="dxa"/>
+            </w:tcMar>
+          </w:tcPr>
+          <w:p>
+            <w:pPr>
+              <w:pStyle w:val="BDOITable"/>
+            </w:pPr>
+            <w:r>
+              <w:rPr>
+                <w:sz w:val="15"/>
+              </w:rPr>
+              <w:t>Product Owner</w:t>
+            </w:r>
+          </w:p>
+        </w:tc>
+      </w:tr>
+      <w:tr>
+        <w:tc>
+          <w:tcPr>
+            <w:tcW w:type="dxa" w:w="2946"/>
+            <w:tcMar>
+              <w:top w:w="50" w:type="dxa"/>
+              <w:bottom w:w="50" w:type="dxa"/>
+              <w:left w:w="90" w:type="dxa"/>
+              <w:right w:w="90" w:type="dxa"/>
+            </w:tcMar>
+            <w:shd w:val="clear" w:color="auto" w:fill="E5F5FF"/>
+          </w:tcPr>
+          <w:p>
+            <w:pPr>
+              <w:pStyle w:val="BDOITable"/>
+            </w:pPr>
+            <w:r>
+              <w:rPr>
+                <w:b/>
+                <w:sz w:val="15"/>
+              </w:rPr>
+              <w:t>Proposed business rules and clarifications for confirmation</w:t>
+            </w:r>
+          </w:p>
+        </w:tc>
+        <w:tc>
+          <w:tcPr>
+            <w:tcW w:type="dxa" w:w="1360"/>
+            <w:tcMar>
+              <w:top w:w="50" w:type="dxa"/>
+              <w:bottom w:w="50" w:type="dxa"/>
+              <w:left w:w="90" w:type="dxa"/>
+              <w:right w:w="90" w:type="dxa"/>
+            </w:tcMar>
+            <w:shd w:val="clear" w:color="auto" w:fill="E5F5FF"/>
+          </w:tcPr>
+          <w:p>
+            <w:pPr>
+              <w:pStyle w:val="BDOITable"/>
+            </w:pPr>
+            <w:r>
+              <w:rPr>
+                <w:sz w:val="15"/>
+              </w:rPr>
+              <w:t>iorta TechNXT</w:t>
+            </w:r>
+          </w:p>
+        </w:tc>
+        <w:tc>
+          <w:tcPr>
+            <w:tcW w:type="dxa" w:w="1813"/>
+            <w:tcMar>
+              <w:top w:w="50" w:type="dxa"/>
+              <w:bottom w:w="50" w:type="dxa"/>
+              <w:left w:w="90" w:type="dxa"/>
+              <w:right w:w="90" w:type="dxa"/>
+            </w:tcMar>
+            <w:shd w:val="clear" w:color="auto" w:fill="E5F5FF"/>
+          </w:tcPr>
+          <w:p>
+            <w:pPr>
+              <w:pStyle w:val="BDOITable"/>
+            </w:pPr>
+            <w:r>
+              <w:rPr>
+                <w:sz w:val="15"/>
+              </w:rPr>
+              <w:t>BA (BPS), MBS, TSU</w:t>
+            </w:r>
+          </w:p>
+        </w:tc>
+        <w:tc>
+          <w:tcPr>
+            <w:tcW w:type="dxa" w:w="1700"/>
+            <w:tcMar>
+              <w:top w:w="50" w:type="dxa"/>
+              <w:bottom w:w="50" w:type="dxa"/>
+              <w:left w:w="90" w:type="dxa"/>
+              <w:right w:w="90" w:type="dxa"/>
+            </w:tcMar>
+            <w:shd w:val="clear" w:color="auto" w:fill="E5F5FF"/>
+          </w:tcPr>
+          <w:p>
+            <w:pPr>
+              <w:pStyle w:val="BDOITable"/>
+            </w:pPr>
+            <w:r>
+              <w:rPr>
+                <w:sz w:val="15"/>
+              </w:rPr>
+              <w:t>Program Manager (BPS)</w:t>
+            </w:r>
+          </w:p>
+        </w:tc>
+        <w:tc>
+          <w:tcPr>
+            <w:tcW w:type="dxa" w:w="2153"/>
+            <w:tcMar>
+              <w:top w:w="50" w:type="dxa"/>
+              <w:bottom w:w="50" w:type="dxa"/>
+              <w:left w:w="90" w:type="dxa"/>
+              <w:right w:w="90" w:type="dxa"/>
+            </w:tcMar>
+            <w:shd w:val="clear" w:color="auto" w:fill="E5F5FF"/>
+          </w:tcPr>
+          <w:p>
+            <w:pPr>
+              <w:pStyle w:val="BDOITable"/>
+            </w:pPr>
+            <w:r>
+              <w:rPr>
+                <w:sz w:val="15"/>
+              </w:rPr>
+              <w:t>Product Owner</w:t>
+            </w:r>
+          </w:p>
+        </w:tc>
+      </w:tr>
+      <w:tr>
+        <w:tc>
+          <w:tcPr>
+            <w:tcW w:type="dxa" w:w="2946"/>
+            <w:tcMar>
+              <w:top w:w="50" w:type="dxa"/>
+              <w:bottom w:w="50" w:type="dxa"/>
+              <w:left w:w="90" w:type="dxa"/>
+              <w:right w:w="90" w:type="dxa"/>
+            </w:tcMar>
+          </w:tcPr>
+          <w:p>
+            <w:pPr>
+              <w:pStyle w:val="BDOITable"/>
+            </w:pPr>
+            <w:r>
+              <w:rPr>
+                <w:b/>
+                <w:sz w:val="15"/>
+              </w:rPr>
+              <w:t>Interfaces, user access and menus by persona</w:t>
+            </w:r>
+          </w:p>
+        </w:tc>
+        <w:tc>
+          <w:tcPr>
+            <w:tcW w:type="dxa" w:w="1360"/>
+            <w:tcMar>
+              <w:top w:w="50" w:type="dxa"/>
+              <w:bottom w:w="50" w:type="dxa"/>
+              <w:left w:w="90" w:type="dxa"/>
+              <w:right w:w="90" w:type="dxa"/>
+            </w:tcMar>
+          </w:tcPr>
+          <w:p>
+            <w:pPr>
+              <w:pStyle w:val="BDOITable"/>
+            </w:pPr>
+            <w:r>
+              <w:rPr>
+                <w:sz w:val="15"/>
+              </w:rPr>
+              <w:t>iorta TechNXT</w:t>
+            </w:r>
+          </w:p>
+        </w:tc>
+        <w:tc>
+          <w:tcPr>
+            <w:tcW w:type="dxa" w:w="1813"/>
+            <w:tcMar>
+              <w:top w:w="50" w:type="dxa"/>
+              <w:bottom w:w="50" w:type="dxa"/>
+              <w:left w:w="90" w:type="dxa"/>
+              <w:right w:w="90" w:type="dxa"/>
+            </w:tcMar>
+          </w:tcPr>
+          <w:p>
+            <w:pPr>
+              <w:pStyle w:val="BDOITable"/>
+            </w:pPr>
+            <w:r>
+              <w:rPr>
+                <w:sz w:val="15"/>
+              </w:rPr>
+              <w:t>MBS</w:t>
+            </w:r>
+          </w:p>
+        </w:tc>
+        <w:tc>
+          <w:tcPr>
+            <w:tcW w:type="dxa" w:w="1700"/>
+            <w:tcMar>
+              <w:top w:w="50" w:type="dxa"/>
+              <w:bottom w:w="50" w:type="dxa"/>
+              <w:left w:w="90" w:type="dxa"/>
+              <w:right w:w="90" w:type="dxa"/>
+            </w:tcMar>
+          </w:tcPr>
+          <w:p>
+            <w:pPr>
+              <w:pStyle w:val="BDOITable"/>
+            </w:pPr>
+            <w:r>
+              <w:rPr>
+                <w:sz w:val="15"/>
+              </w:rPr>
+              <w:t>BDOI IT</w:t>
+            </w:r>
+          </w:p>
+        </w:tc>
+        <w:tc>
+          <w:tcPr>
+            <w:tcW w:type="dxa" w:w="2153"/>
+            <w:tcMar>
+              <w:top w:w="50" w:type="dxa"/>
+              <w:bottom w:w="50" w:type="dxa"/>
+              <w:left w:w="90" w:type="dxa"/>
+              <w:right w:w="90" w:type="dxa"/>
+            </w:tcMar>
+          </w:tcPr>
+          <w:p>
+            <w:pPr>
+              <w:pStyle w:val="BDOITable"/>
+            </w:pPr>
+            <w:r>
+              <w:rPr>
+                <w:sz w:val="15"/>
+              </w:rPr>
+              <w:t>Product Owner</w:t>
+            </w:r>
+          </w:p>
+        </w:tc>
+      </w:tr>
+      <w:tr>
+        <w:tc>
+          <w:tcPr>
+            <w:tcW w:type="dxa" w:w="2946"/>
+            <w:tcMar>
+              <w:top w:w="50" w:type="dxa"/>
+              <w:bottom w:w="50" w:type="dxa"/>
+              <w:left w:w="90" w:type="dxa"/>
+              <w:right w:w="90" w:type="dxa"/>
+            </w:tcMar>
+            <w:shd w:val="clear" w:color="auto" w:fill="E5F5FF"/>
+          </w:tcPr>
+          <w:p>
+            <w:pPr>
+              <w:pStyle w:val="BDOITable"/>
+            </w:pPr>
+            <w:r>
+              <w:rPr>
+                <w:b/>
+                <w:sz w:val="15"/>
+              </w:rPr>
+              <w:t>Test plan (04 workbook, 05 summary)</w:t>
+            </w:r>
+          </w:p>
+        </w:tc>
+        <w:tc>
+          <w:tcPr>
+            <w:tcW w:type="dxa" w:w="1360"/>
+            <w:tcMar>
+              <w:top w:w="50" w:type="dxa"/>
+              <w:bottom w:w="50" w:type="dxa"/>
+              <w:left w:w="90" w:type="dxa"/>
+              <w:right w:w="90" w:type="dxa"/>
+            </w:tcMar>
+            <w:shd w:val="clear" w:color="auto" w:fill="E5F5FF"/>
+          </w:tcPr>
+          <w:p>
+            <w:pPr>
+              <w:pStyle w:val="BDOITable"/>
+            </w:pPr>
+            <w:r>
+              <w:rPr>
+                <w:sz w:val="15"/>
+              </w:rPr>
+              <w:t>iorta TechNXT</w:t>
+            </w:r>
+          </w:p>
+        </w:tc>
+        <w:tc>
+          <w:tcPr>
+            <w:tcW w:type="dxa" w:w="1813"/>
+            <w:tcMar>
+              <w:top w:w="50" w:type="dxa"/>
+              <w:bottom w:w="50" w:type="dxa"/>
+              <w:left w:w="90" w:type="dxa"/>
+              <w:right w:w="90" w:type="dxa"/>
+            </w:tcMar>
+            <w:shd w:val="clear" w:color="auto" w:fill="E5F5FF"/>
+          </w:tcPr>
+          <w:p>
+            <w:pPr>
+              <w:pStyle w:val="BDOITable"/>
+            </w:pPr>
+            <w:r>
+              <w:rPr>
+                <w:sz w:val="15"/>
+              </w:rPr>
+              <w:t>TSU, MBS</w:t>
+            </w:r>
+          </w:p>
+        </w:tc>
+        <w:tc>
+          <w:tcPr>
+            <w:tcW w:type="dxa" w:w="1700"/>
+            <w:tcMar>
+              <w:top w:w="50" w:type="dxa"/>
+              <w:bottom w:w="50" w:type="dxa"/>
+              <w:left w:w="90" w:type="dxa"/>
+              <w:right w:w="90" w:type="dxa"/>
+            </w:tcMar>
+            <w:shd w:val="clear" w:color="auto" w:fill="E5F5FF"/>
+          </w:tcPr>
+          <w:p>
+            <w:pPr>
+              <w:pStyle w:val="BDOITable"/>
+            </w:pPr>
+            <w:r>
+              <w:rPr>
+                <w:sz w:val="15"/>
+              </w:rPr>
+              <w:t>Program Manager (BPS), BDOI IT</w:t>
+            </w:r>
+          </w:p>
+        </w:tc>
+        <w:tc>
+          <w:tcPr>
+            <w:tcW w:type="dxa" w:w="2153"/>
+            <w:tcMar>
+              <w:top w:w="50" w:type="dxa"/>
+              <w:bottom w:w="50" w:type="dxa"/>
+              <w:left w:w="90" w:type="dxa"/>
+              <w:right w:w="90" w:type="dxa"/>
+            </w:tcMar>
+            <w:shd w:val="clear" w:color="auto" w:fill="E5F5FF"/>
+          </w:tcPr>
+          <w:p>
+            <w:pPr>
+              <w:pStyle w:val="BDOITable"/>
+            </w:pPr>
+            <w:r>
+              <w:rPr>
+                <w:sz w:val="15"/>
+              </w:rPr>
+              <w:t>Product Owner</w:t>
+            </w:r>
+          </w:p>
+        </w:tc>
+      </w:tr>
+      <w:tr>
+        <w:tc>
+          <w:tcPr>
+            <w:tcW w:type="dxa" w:w="2946"/>
+            <w:tcMar>
+              <w:top w:w="50" w:type="dxa"/>
+              <w:bottom w:w="50" w:type="dxa"/>
+              <w:left w:w="90" w:type="dxa"/>
+              <w:right w:w="90" w:type="dxa"/>
+            </w:tcMar>
+          </w:tcPr>
+          <w:p>
+            <w:pPr>
+              <w:pStyle w:val="BDOITable"/>
+            </w:pPr>
+            <w:r>
+              <w:rPr>
+                <w:b/>
+                <w:sz w:val="15"/>
+              </w:rPr>
+              <w:t>Configuration inputs (06 templates, Drop 0)</w:t>
+            </w:r>
+          </w:p>
+        </w:tc>
+        <w:tc>
+          <w:tcPr>
+            <w:tcW w:type="dxa" w:w="1360"/>
+            <w:tcMar>
+              <w:top w:w="50" w:type="dxa"/>
+              <w:bottom w:w="50" w:type="dxa"/>
+              <w:left w:w="90" w:type="dxa"/>
+              <w:right w:w="90" w:type="dxa"/>
+            </w:tcMar>
+          </w:tcPr>
+          <w:p>
+            <w:pPr>
+              <w:pStyle w:val="BDOITable"/>
+            </w:pPr>
+            <w:r>
+              <w:rPr>
+                <w:sz w:val="15"/>
+              </w:rPr>
+              <w:t>iorta TechNXT</w:t>
+            </w:r>
+          </w:p>
+        </w:tc>
+        <w:tc>
+          <w:tcPr>
+            <w:tcW w:type="dxa" w:w="1813"/>
+            <w:tcMar>
+              <w:top w:w="50" w:type="dxa"/>
+              <w:bottom w:w="50" w:type="dxa"/>
+              <w:left w:w="90" w:type="dxa"/>
+              <w:right w:w="90" w:type="dxa"/>
+            </w:tcMar>
+          </w:tcPr>
+          <w:p>
+            <w:pPr>
+              <w:pStyle w:val="BDOITable"/>
+            </w:pPr>
+            <w:r>
+              <w:rPr>
+                <w:sz w:val="15"/>
+              </w:rPr>
+              <w:t>MBS, TSU</w:t>
+            </w:r>
+          </w:p>
+        </w:tc>
+        <w:tc>
+          <w:tcPr>
+            <w:tcW w:type="dxa" w:w="1700"/>
+            <w:tcMar>
+              <w:top w:w="50" w:type="dxa"/>
+              <w:bottom w:w="50" w:type="dxa"/>
+              <w:left w:w="90" w:type="dxa"/>
+              <w:right w:w="90" w:type="dxa"/>
+            </w:tcMar>
+          </w:tcPr>
+          <w:p>
+            <w:pPr>
+              <w:pStyle w:val="BDOITable"/>
+            </w:pPr>
+            <w:r>
+              <w:rPr>
+                <w:sz w:val="15"/>
+              </w:rPr>
+              <w:t>MBS, Program Manager (BPS)</w:t>
+            </w:r>
+          </w:p>
+        </w:tc>
+        <w:tc>
+          <w:tcPr>
+            <w:tcW w:type="dxa" w:w="2153"/>
+            <w:tcMar>
+              <w:top w:w="50" w:type="dxa"/>
+              <w:bottom w:w="50" w:type="dxa"/>
+              <w:left w:w="90" w:type="dxa"/>
+              <w:right w:w="90" w:type="dxa"/>
+            </w:tcMar>
+          </w:tcPr>
+          <w:p>
+            <w:pPr>
+              <w:pStyle w:val="BDOITable"/>
+            </w:pPr>
+            <w:r>
+              <w:rPr>
+                <w:sz w:val="15"/>
+              </w:rPr>
+              <w:t>Product Owner, Head Comptrollership</w:t>
+            </w:r>
+          </w:p>
+        </w:tc>
+      </w:tr>
+      <w:tr>
+        <w:tc>
+          <w:tcPr>
+            <w:tcW w:type="dxa" w:w="2946"/>
+            <w:tcMar>
+              <w:top w:w="50" w:type="dxa"/>
+              <w:bottom w:w="50" w:type="dxa"/>
+              <w:left w:w="90" w:type="dxa"/>
+              <w:right w:w="90" w:type="dxa"/>
+            </w:tcMar>
+            <w:shd w:val="clear" w:color="auto" w:fill="E5F5FF"/>
+          </w:tcPr>
+          <w:p>
+            <w:pPr>
+              <w:pStyle w:val="BDOITable"/>
+            </w:pPr>
+            <w:r>
+              <w:rPr>
+                <w:b/>
+                <w:sz w:val="15"/>
+              </w:rPr>
+              <w:t>Technical Specification (separate document, not part of the business sign-off)</w:t>
+            </w:r>
+          </w:p>
+        </w:tc>
+        <w:tc>
+          <w:tcPr>
+            <w:tcW w:type="dxa" w:w="1360"/>
+            <w:tcMar>
+              <w:top w:w="50" w:type="dxa"/>
+              <w:bottom w:w="50" w:type="dxa"/>
+              <w:left w:w="90" w:type="dxa"/>
+              <w:right w:w="90" w:type="dxa"/>
+            </w:tcMar>
+            <w:shd w:val="clear" w:color="auto" w:fill="E5F5FF"/>
+          </w:tcPr>
+          <w:p>
+            <w:pPr>
+              <w:pStyle w:val="BDOITable"/>
+            </w:pPr>
+            <w:r>
+              <w:rPr>
+                <w:sz w:val="15"/>
+              </w:rPr>
+              <w:t>iorta TechNXT</w:t>
+            </w:r>
+          </w:p>
+        </w:tc>
+        <w:tc>
+          <w:tcPr>
+            <w:tcW w:type="dxa" w:w="1813"/>
+            <w:tcMar>
+              <w:top w:w="50" w:type="dxa"/>
+              <w:bottom w:w="50" w:type="dxa"/>
+              <w:left w:w="90" w:type="dxa"/>
+              <w:right w:w="90" w:type="dxa"/>
+            </w:tcMar>
+            <w:shd w:val="clear" w:color="auto" w:fill="E5F5FF"/>
+          </w:tcPr>
+          <w:p>
+            <w:pPr>
+              <w:pStyle w:val="BDOITable"/>
+            </w:pPr>
+            <w:r>
+              <w:rPr>
+                <w:sz w:val="15"/>
+              </w:rPr>
+              <w:t>BDOI IT</w:t>
+            </w:r>
+          </w:p>
+        </w:tc>
+        <w:tc>
+          <w:tcPr>
+            <w:tcW w:type="dxa" w:w="1700"/>
+            <w:tcMar>
+              <w:top w:w="50" w:type="dxa"/>
+              <w:bottom w:w="50" w:type="dxa"/>
+              <w:left w:w="90" w:type="dxa"/>
+              <w:right w:w="90" w:type="dxa"/>
+            </w:tcMar>
+            <w:shd w:val="clear" w:color="auto" w:fill="E5F5FF"/>
+          </w:tcPr>
+          <w:p>
+            <w:pPr>
+              <w:pStyle w:val="BDOITable"/>
+            </w:pPr>
+            <w:r>
+              <w:rPr>
+                <w:sz w:val="15"/>
+              </w:rPr>
+              <w:t>BDOI IT</w:t>
+            </w:r>
+          </w:p>
+        </w:tc>
+        <w:tc>
+          <w:tcPr>
+            <w:tcW w:type="dxa" w:w="2153"/>
+            <w:tcMar>
+              <w:top w:w="50" w:type="dxa"/>
+              <w:bottom w:w="50" w:type="dxa"/>
+              <w:left w:w="90" w:type="dxa"/>
+              <w:right w:w="90" w:type="dxa"/>
+            </w:tcMar>
+            <w:shd w:val="clear" w:color="auto" w:fill="E5F5FF"/>
+          </w:tcPr>
+          <w:p>
+            <w:pPr>
+              <w:pStyle w:val="BDOITable"/>
+            </w:pPr>
+            <w:r>
+              <w:rPr>
+                <w:sz w:val="15"/>
+              </w:rPr>
+              <w:t>BDOI IT</w:t>
+            </w:r>
+          </w:p>
+        </w:tc>
+      </w:tr>
+    </w:tbl>
+    <w:p>
+      <w:pPr>
+        <w:pStyle w:val="BDOISpacer"/>
+      </w:pPr>
+    </w:p>
+    <w:p>
+      <w:pPr>
+        <w:pStyle w:val="Caption"/>
+        <w:keepNext/>
+        <w:spacing w:after="60"/>
+      </w:pPr>
+      <w:r>
+        <w:rPr>
+          <w:b/>
+          <w:i w:val="0"/>
+        </w:rPr>
+        <w:t xml:space="preserve">Table 6: </w:t>
+      </w:r>
+      <w:r>
+        <w:rPr/>
+        <w:t>Signatories and what each confirms (BRD-3 approval sheets: main BRD p.34-35; Workshop Addendum p.8-9)</w:t>
+      </w:r>
+    </w:p>
+    <w:tbl>
+      <w:tblPr>
+        <w:tblW w:type="dxa" w:w="9973"/>
+        <w:jc w:val="center"/>
+        <w:tblLook w:firstColumn="1" w:firstRow="1" w:lastColumn="0" w:lastRow="0" w:noHBand="0" w:noVBand="1" w:val="04A0"/>
+        <w:tblBorders>
+          <w:top w:val="single" w:sz="4" w:space="0" w:color="C2C2C1"/>
+          <w:left w:val="single" w:sz="4" w:space="0" w:color="C2C2C1"/>
+          <w:bottom w:val="single" w:sz="4" w:space="0" w:color="C2C2C1"/>
+          <w:right w:val="single" w:sz="4" w:space="0" w:color="C2C2C1"/>
+          <w:insideH w:val="single" w:sz="4" w:space="0" w:color="C2C2C1"/>
+          <w:insideV w:val="single" w:sz="4" w:space="0" w:color="C2C2C1"/>
+        </w:tblBorders>
+        <w:tblLayout w:type="fixed"/>
+      </w:tblPr>
+      <w:tblGrid>
+        <w:gridCol w:w="1246"/>
+        <w:gridCol w:w="2833"/>
+        <w:gridCol w:w="3853"/>
+        <w:gridCol w:w="2039"/>
+      </w:tblGrid>
+      <w:tr>
+        <w:trPr>
+          <w:tblHeader w:val="true"/>
+          <w:cantSplit w:val="true"/>
+        </w:trPr>
+        <w:tc>
+          <w:tcPr>
+            <w:tcW w:type="dxa" w:w="1246"/>
+            <w:shd w:val="clear" w:color="auto" w:fill="004EA8"/>
+            <w:tcMar>
+              <w:top w:w="50" w:type="dxa"/>
+              <w:bottom w:w="50" w:type="dxa"/>
+              <w:left w:w="90" w:type="dxa"/>
+              <w:right w:w="90" w:type="dxa"/>
+            </w:tcMar>
+            <w:vAlign w:val="center"/>
+          </w:tcPr>
+          <w:p>
+            <w:pPr>
+              <w:pStyle w:val="BDOITableHeader"/>
+            </w:pPr>
+            <w:r>
+              <w:rPr>
+                <w:b/>
+                <w:color w:val="FFFFFF"/>
+                <w:sz w:val="15"/>
+              </w:rPr>
+              <w:t>Capacity</w:t>
+            </w:r>
+          </w:p>
+        </w:tc>
+        <w:tc>
+          <w:tcPr>
+            <w:tcW w:type="dxa" w:w="2833"/>
+            <w:shd w:val="clear" w:color="auto" w:fill="004EA8"/>
+            <w:tcMar>
+              <w:top w:w="50" w:type="dxa"/>
+              <w:bottom w:w="50" w:type="dxa"/>
+              <w:left w:w="90" w:type="dxa"/>
+              <w:right w:w="90" w:type="dxa"/>
+            </w:tcMar>
+            <w:vAlign w:val="center"/>
+          </w:tcPr>
+          <w:p>
+            <w:pPr>
+              <w:pStyle w:val="BDOITableHeader"/>
+            </w:pPr>
+            <w:r>
+              <w:rPr>
+                <w:b/>
+                <w:color w:val="FFFFFF"/>
+                <w:sz w:val="15"/>
+              </w:rPr>
+              <w:t>Role</w:t>
+            </w:r>
+          </w:p>
+        </w:tc>
+        <w:tc>
+          <w:tcPr>
+            <w:tcW w:type="dxa" w:w="3853"/>
+            <w:shd w:val="clear" w:color="auto" w:fill="004EA8"/>
+            <w:tcMar>
+              <w:top w:w="50" w:type="dxa"/>
+              <w:bottom w:w="50" w:type="dxa"/>
+              <w:left w:w="90" w:type="dxa"/>
+              <w:right w:w="90" w:type="dxa"/>
+            </w:tcMar>
+            <w:vAlign w:val="center"/>
+          </w:tcPr>
+          <w:p>
+            <w:pPr>
+              <w:pStyle w:val="BDOITableHeader"/>
+            </w:pPr>
+            <w:r>
+              <w:rPr>
+                <w:b/>
+                <w:color w:val="FFFFFF"/>
+                <w:sz w:val="15"/>
+              </w:rPr>
+              <w:t>Confirms by signing</w:t>
+            </w:r>
+          </w:p>
+        </w:tc>
+        <w:tc>
+          <w:tcPr>
+            <w:tcW w:type="dxa" w:w="2040"/>
+            <w:shd w:val="clear" w:color="auto" w:fill="004EA8"/>
+            <w:tcMar>
+              <w:top w:w="50" w:type="dxa"/>
+              <w:bottom w:w="50" w:type="dxa"/>
+              <w:left w:w="90" w:type="dxa"/>
+              <w:right w:w="90" w:type="dxa"/>
+            </w:tcMar>
+            <w:vAlign w:val="center"/>
+          </w:tcPr>
+          <w:p>
+            <w:pPr>
+              <w:pStyle w:val="BDOITableHeader"/>
+            </w:pPr>
+            <w:r>
+              <w:rPr>
+                <w:b/>
+                <w:color w:val="FFFFFF"/>
+                <w:sz w:val="15"/>
+              </w:rPr>
+              <w:t>On the BRD approval sheet</w:t>
+            </w:r>
+          </w:p>
+        </w:tc>
+      </w:tr>
+      <w:tr>
+        <w:tc>
+          <w:tcPr>
+            <w:tcW w:type="dxa" w:w="1246"/>
+            <w:tcMar>
+              <w:top w:w="50" w:type="dxa"/>
+              <w:bottom w:w="50" w:type="dxa"/>
+              <w:left w:w="90" w:type="dxa"/>
+              <w:right w:w="90" w:type="dxa"/>
+            </w:tcMar>
+          </w:tcPr>
+          <w:p>
+            <w:pPr>
+              <w:pStyle w:val="BDOITable"/>
+            </w:pPr>
+            <w:r>
+              <w:rPr>
+                <w:sz w:val="15"/>
+              </w:rPr>
+              <w:t>Prepared by</w:t>
+            </w:r>
+          </w:p>
+        </w:tc>
+        <w:tc>
+          <w:tcPr>
+            <w:tcW w:type="dxa" w:w="2833"/>
+            <w:tcMar>
+              <w:top w:w="50" w:type="dxa"/>
+              <w:bottom w:w="50" w:type="dxa"/>
+              <w:left w:w="90" w:type="dxa"/>
+              <w:right w:w="90" w:type="dxa"/>
+            </w:tcMar>
+          </w:tcPr>
+          <w:p>
+            <w:pPr>
+              <w:pStyle w:val="BDOITable"/>
+            </w:pPr>
+            <w:r>
+              <w:rPr>
+                <w:sz w:val="15"/>
+              </w:rPr>
+              <w:t>iorta TechNXT project team: Project Manager, Business Analysis, test lead (iorta TechNXT)</w:t>
+            </w:r>
+          </w:p>
+        </w:tc>
+        <w:tc>
+          <w:tcPr>
+            <w:tcW w:type="dxa" w:w="3853"/>
+            <w:tcMar>
+              <w:top w:w="50" w:type="dxa"/>
+              <w:bottom w:w="50" w:type="dxa"/>
+              <w:left w:w="90" w:type="dxa"/>
+              <w:right w:w="90" w:type="dxa"/>
+            </w:tcMar>
+          </w:tcPr>
+          <w:p>
+            <w:pPr>
+              <w:pStyle w:val="BDOITable"/>
+            </w:pPr>
+            <w:r>
+              <w:rPr>
+                <w:sz w:val="15"/>
+              </w:rPr>
+              <w:t>The set is complete and consistent as issued, traced to the BRD and to the screens; every comment is answered in the comments log</w:t>
+            </w:r>
+          </w:p>
+        </w:tc>
+        <w:tc>
+          <w:tcPr>
+            <w:tcW w:type="dxa" w:w="2040"/>
+            <w:tcMar>
+              <w:top w:w="50" w:type="dxa"/>
+              <w:bottom w:w="50" w:type="dxa"/>
+              <w:left w:w="90" w:type="dxa"/>
+              <w:right w:w="90" w:type="dxa"/>
+            </w:tcMar>
+          </w:tcPr>
+          <w:p>
+            <w:pPr>
+              <w:pStyle w:val="BDOITable"/>
+            </w:pPr>
+            <w:r>
+              <w:rPr>
+                <w:sz w:val="15"/>
+              </w:rPr>
+              <w:t>Added for this set (author of the FRS set)</w:t>
+            </w:r>
+          </w:p>
+        </w:tc>
+      </w:tr>
+      <w:tr>
+        <w:tc>
+          <w:tcPr>
+            <w:tcW w:type="dxa" w:w="1246"/>
+            <w:tcMar>
+              <w:top w:w="50" w:type="dxa"/>
+              <w:bottom w:w="50" w:type="dxa"/>
+              <w:left w:w="90" w:type="dxa"/>
+              <w:right w:w="90" w:type="dxa"/>
+            </w:tcMar>
+            <w:shd w:val="clear" w:color="auto" w:fill="E5F5FF"/>
+          </w:tcPr>
+          <w:p>
+            <w:pPr>
+              <w:pStyle w:val="BDOITable"/>
+            </w:pPr>
+            <w:r>
+              <w:rPr>
+                <w:sz w:val="15"/>
+              </w:rPr>
+              <w:t>Prepared by</w:t>
+            </w:r>
+          </w:p>
+        </w:tc>
+        <w:tc>
+          <w:tcPr>
+            <w:tcW w:type="dxa" w:w="2833"/>
+            <w:tcMar>
+              <w:top w:w="50" w:type="dxa"/>
+              <w:bottom w:w="50" w:type="dxa"/>
+              <w:left w:w="90" w:type="dxa"/>
+              <w:right w:w="90" w:type="dxa"/>
+            </w:tcMar>
+            <w:shd w:val="clear" w:color="auto" w:fill="E5F5FF"/>
+          </w:tcPr>
+          <w:p>
+            <w:pPr>
+              <w:pStyle w:val="BDOITable"/>
+            </w:pPr>
+            <w:r>
+              <w:rPr>
+                <w:sz w:val="15"/>
+              </w:rPr>
+              <w:t>Business Analyst, Enterprise Services Group - Business Project Services (BPS) (BDO Unibank ESG)</w:t>
+            </w:r>
+          </w:p>
+        </w:tc>
+        <w:tc>
+          <w:tcPr>
+            <w:tcW w:type="dxa" w:w="3853"/>
+            <w:tcMar>
+              <w:top w:w="50" w:type="dxa"/>
+              <w:bottom w:w="50" w:type="dxa"/>
+              <w:left w:w="90" w:type="dxa"/>
+              <w:right w:w="90" w:type="dxa"/>
+            </w:tcMar>
+            <w:shd w:val="clear" w:color="auto" w:fill="E5F5FF"/>
+          </w:tcPr>
+          <w:p>
+            <w:pPr>
+              <w:pStyle w:val="BDOITable"/>
+            </w:pPr>
+            <w:r>
+              <w:rPr>
+                <w:sz w:val="15"/>
+              </w:rPr>
+              <w:t>The set states the BRD requirements as written; every departure is listed in the proposed rules and clarifications</w:t>
+            </w:r>
+          </w:p>
+        </w:tc>
+        <w:tc>
+          <w:tcPr>
+            <w:tcW w:type="dxa" w:w="2040"/>
+            <w:tcMar>
+              <w:top w:w="50" w:type="dxa"/>
+              <w:bottom w:w="50" w:type="dxa"/>
+              <w:left w:w="90" w:type="dxa"/>
+              <w:right w:w="90" w:type="dxa"/>
+            </w:tcMar>
+            <w:shd w:val="clear" w:color="auto" w:fill="E5F5FF"/>
+          </w:tcPr>
+          <w:p>
+            <w:pPr>
+              <w:pStyle w:val="BDOITable"/>
+            </w:pPr>
+            <w:r>
+              <w:rPr>
+                <w:sz w:val="15"/>
+              </w:rPr>
+              <w:t>Prepared by (p.34, p.8)</w:t>
+            </w:r>
+          </w:p>
+        </w:tc>
+      </w:tr>
+      <w:tr>
+        <w:tc>
+          <w:tcPr>
+            <w:tcW w:type="dxa" w:w="1246"/>
+            <w:tcMar>
+              <w:top w:w="50" w:type="dxa"/>
+              <w:bottom w:w="50" w:type="dxa"/>
+              <w:left w:w="90" w:type="dxa"/>
+              <w:right w:w="90" w:type="dxa"/>
+            </w:tcMar>
+          </w:tcPr>
+          <w:p>
+            <w:pPr>
+              <w:pStyle w:val="BDOITable"/>
+            </w:pPr>
+            <w:r>
+              <w:rPr>
+                <w:sz w:val="15"/>
+              </w:rPr>
+              <w:t>Input provided by</w:t>
+            </w:r>
+          </w:p>
+        </w:tc>
+        <w:tc>
+          <w:tcPr>
+            <w:tcW w:type="dxa" w:w="2833"/>
+            <w:tcMar>
+              <w:top w:w="50" w:type="dxa"/>
+              <w:bottom w:w="50" w:type="dxa"/>
+              <w:left w:w="90" w:type="dxa"/>
+              <w:right w:w="90" w:type="dxa"/>
+            </w:tcMar>
+          </w:tcPr>
+          <w:p>
+            <w:pPr>
+              <w:pStyle w:val="BDOITable"/>
+            </w:pPr>
+            <w:r>
+              <w:rPr>
+                <w:sz w:val="15"/>
+              </w:rPr>
+              <w:t>Technical Support Unit (TSU), BU representatives (BDOI)</w:t>
+            </w:r>
+          </w:p>
+        </w:tc>
+        <w:tc>
+          <w:tcPr>
+            <w:tcW w:type="dxa" w:w="3853"/>
+            <w:tcMar>
+              <w:top w:w="50" w:type="dxa"/>
+              <w:bottom w:w="50" w:type="dxa"/>
+              <w:left w:w="90" w:type="dxa"/>
+              <w:right w:w="90" w:type="dxa"/>
+            </w:tcMar>
+          </w:tcPr>
+          <w:p>
+            <w:pPr>
+              <w:pStyle w:val="BDOITable"/>
+            </w:pPr>
+            <w:r>
+              <w:rPr>
+                <w:sz w:val="15"/>
+              </w:rPr>
+              <w:t>The package request, negotiation, requirements, advisory and expiry screens match the business input</w:t>
+            </w:r>
+          </w:p>
+        </w:tc>
+        <w:tc>
+          <w:tcPr>
+            <w:tcW w:type="dxa" w:w="2040"/>
+            <w:tcMar>
+              <w:top w:w="50" w:type="dxa"/>
+              <w:bottom w:w="50" w:type="dxa"/>
+              <w:left w:w="90" w:type="dxa"/>
+              <w:right w:w="90" w:type="dxa"/>
+            </w:tcMar>
+          </w:tcPr>
+          <w:p>
+            <w:pPr>
+              <w:pStyle w:val="BDOITable"/>
+            </w:pPr>
+            <w:r>
+              <w:rPr>
+                <w:sz w:val="15"/>
+              </w:rPr>
+              <w:t>Input provided by (p.34, p.8)</w:t>
+            </w:r>
+          </w:p>
+        </w:tc>
+      </w:tr>
+      <w:tr>
+        <w:tc>
+          <w:tcPr>
+            <w:tcW w:type="dxa" w:w="1246"/>
+            <w:tcMar>
+              <w:top w:w="50" w:type="dxa"/>
+              <w:bottom w:w="50" w:type="dxa"/>
+              <w:left w:w="90" w:type="dxa"/>
+              <w:right w:w="90" w:type="dxa"/>
+            </w:tcMar>
+            <w:shd w:val="clear" w:color="auto" w:fill="E5F5FF"/>
+          </w:tcPr>
+          <w:p>
+            <w:pPr>
+              <w:pStyle w:val="BDOITable"/>
+            </w:pPr>
+            <w:r>
+              <w:rPr>
+                <w:sz w:val="15"/>
+              </w:rPr>
+              <w:t>Input provided by</w:t>
+            </w:r>
+          </w:p>
+        </w:tc>
+        <w:tc>
+          <w:tcPr>
+            <w:tcW w:type="dxa" w:w="2833"/>
+            <w:tcMar>
+              <w:top w:w="50" w:type="dxa"/>
+              <w:bottom w:w="50" w:type="dxa"/>
+              <w:left w:w="90" w:type="dxa"/>
+              <w:right w:w="90" w:type="dxa"/>
+            </w:tcMar>
+            <w:shd w:val="clear" w:color="auto" w:fill="E5F5FF"/>
+          </w:tcPr>
+          <w:p>
+            <w:pPr>
+              <w:pStyle w:val="BDOITable"/>
+            </w:pPr>
+            <w:r>
+              <w:rPr>
+                <w:sz w:val="15"/>
+              </w:rPr>
+              <w:t>Marketing Business System (MBS), BU representatives (BDOI)</w:t>
+            </w:r>
+          </w:p>
+        </w:tc>
+        <w:tc>
+          <w:tcPr>
+            <w:tcW w:type="dxa" w:w="3853"/>
+            <w:tcMar>
+              <w:top w:w="50" w:type="dxa"/>
+              <w:bottom w:w="50" w:type="dxa"/>
+              <w:left w:w="90" w:type="dxa"/>
+              <w:right w:w="90" w:type="dxa"/>
+            </w:tcMar>
+            <w:shd w:val="clear" w:color="auto" w:fill="E5F5FF"/>
+          </w:tcPr>
+          <w:p>
+            <w:pPr>
+              <w:pStyle w:val="BDOITable"/>
+            </w:pPr>
+            <w:r>
+              <w:rPr>
+                <w:sz w:val="15"/>
+              </w:rPr>
+              <w:t>The set-up, version, master and incentive screens and the configuration inputs match the business input</w:t>
+            </w:r>
+          </w:p>
+        </w:tc>
+        <w:tc>
+          <w:tcPr>
+            <w:tcW w:type="dxa" w:w="2040"/>
+            <w:tcMar>
+              <w:top w:w="50" w:type="dxa"/>
+              <w:bottom w:w="50" w:type="dxa"/>
+              <w:left w:w="90" w:type="dxa"/>
+              <w:right w:w="90" w:type="dxa"/>
+            </w:tcMar>
+            <w:shd w:val="clear" w:color="auto" w:fill="E5F5FF"/>
+          </w:tcPr>
+          <w:p>
+            <w:pPr>
+              <w:pStyle w:val="BDOITable"/>
+            </w:pPr>
+            <w:r>
+              <w:rPr>
+                <w:sz w:val="15"/>
+              </w:rPr>
+              <w:t>Input provided by and Reviewed by (p.34, p.8)</w:t>
+            </w:r>
+          </w:p>
+        </w:tc>
+      </w:tr>
+      <w:tr>
+        <w:tc>
+          <w:tcPr>
+            <w:tcW w:type="dxa" w:w="1246"/>
+            <w:tcMar>
+              <w:top w:w="50" w:type="dxa"/>
+              <w:bottom w:w="50" w:type="dxa"/>
+              <w:left w:w="90" w:type="dxa"/>
+              <w:right w:w="90" w:type="dxa"/>
+            </w:tcMar>
+          </w:tcPr>
+          <w:p>
+            <w:pPr>
+              <w:pStyle w:val="BDOITable"/>
+            </w:pPr>
+            <w:r>
+              <w:rPr>
+                <w:sz w:val="15"/>
+              </w:rPr>
+              <w:t>Reviewed by</w:t>
+            </w:r>
+          </w:p>
+        </w:tc>
+        <w:tc>
+          <w:tcPr>
+            <w:tcW w:type="dxa" w:w="2833"/>
+            <w:tcMar>
+              <w:top w:w="50" w:type="dxa"/>
+              <w:bottom w:w="50" w:type="dxa"/>
+              <w:left w:w="90" w:type="dxa"/>
+              <w:right w:w="90" w:type="dxa"/>
+            </w:tcMar>
+          </w:tcPr>
+          <w:p>
+            <w:pPr>
+              <w:pStyle w:val="BDOITable"/>
+            </w:pPr>
+            <w:r>
+              <w:rPr>
+                <w:sz w:val="15"/>
+              </w:rPr>
+              <w:t>Program Manager, Enterprise Services Group - Business Project Services (BPS) (BDO Unibank ESG)</w:t>
+            </w:r>
+          </w:p>
+        </w:tc>
+        <w:tc>
+          <w:tcPr>
+            <w:tcW w:type="dxa" w:w="3853"/>
+            <w:tcMar>
+              <w:top w:w="50" w:type="dxa"/>
+              <w:bottom w:w="50" w:type="dxa"/>
+              <w:left w:w="90" w:type="dxa"/>
+              <w:right w:w="90" w:type="dxa"/>
+            </w:tcMar>
+          </w:tcPr>
+          <w:p>
+            <w:pPr>
+              <w:pStyle w:val="BDOITable"/>
+            </w:pPr>
+            <w:r>
+              <w:rPr>
+                <w:sz w:val="15"/>
+              </w:rPr>
+              <w:t>Traceability of every BRD requirement to the set and completeness of the set</w:t>
+            </w:r>
+          </w:p>
+        </w:tc>
+        <w:tc>
+          <w:tcPr>
+            <w:tcW w:type="dxa" w:w="2040"/>
+            <w:tcMar>
+              <w:top w:w="50" w:type="dxa"/>
+              <w:bottom w:w="50" w:type="dxa"/>
+              <w:left w:w="90" w:type="dxa"/>
+              <w:right w:w="90" w:type="dxa"/>
+            </w:tcMar>
+          </w:tcPr>
+          <w:p>
+            <w:pPr>
+              <w:pStyle w:val="BDOITable"/>
+            </w:pPr>
+            <w:r>
+              <w:rPr>
+                <w:sz w:val="15"/>
+              </w:rPr>
+              <w:t>Reviewed by (p.34, p.9)</w:t>
+            </w:r>
+          </w:p>
+        </w:tc>
+      </w:tr>
+      <w:tr>
+        <w:tc>
+          <w:tcPr>
+            <w:tcW w:type="dxa" w:w="1246"/>
+            <w:tcMar>
+              <w:top w:w="50" w:type="dxa"/>
+              <w:bottom w:w="50" w:type="dxa"/>
+              <w:left w:w="90" w:type="dxa"/>
+              <w:right w:w="90" w:type="dxa"/>
+            </w:tcMar>
+            <w:shd w:val="clear" w:color="auto" w:fill="E5F5FF"/>
+          </w:tcPr>
+          <w:p>
+            <w:pPr>
+              <w:pStyle w:val="BDOITable"/>
+            </w:pPr>
+            <w:r>
+              <w:rPr>
+                <w:sz w:val="15"/>
+              </w:rPr>
+              <w:t>Reviewed by</w:t>
+            </w:r>
+          </w:p>
+        </w:tc>
+        <w:tc>
+          <w:tcPr>
+            <w:tcW w:type="dxa" w:w="2833"/>
+            <w:tcMar>
+              <w:top w:w="50" w:type="dxa"/>
+              <w:bottom w:w="50" w:type="dxa"/>
+              <w:left w:w="90" w:type="dxa"/>
+              <w:right w:w="90" w:type="dxa"/>
+            </w:tcMar>
+            <w:shd w:val="clear" w:color="auto" w:fill="E5F5FF"/>
+          </w:tcPr>
+          <w:p>
+            <w:pPr>
+              <w:pStyle w:val="BDOITable"/>
+            </w:pPr>
+            <w:r>
+              <w:rPr>
+                <w:sz w:val="15"/>
+              </w:rPr>
+              <w:t>BDOI Information Technology Group (BDOI IT) (BDOI)</w:t>
+            </w:r>
+          </w:p>
+        </w:tc>
+        <w:tc>
+          <w:tcPr>
+            <w:tcW w:type="dxa" w:w="3853"/>
+            <w:tcMar>
+              <w:top w:w="50" w:type="dxa"/>
+              <w:bottom w:w="50" w:type="dxa"/>
+              <w:left w:w="90" w:type="dxa"/>
+              <w:right w:w="90" w:type="dxa"/>
+            </w:tcMar>
+            <w:shd w:val="clear" w:color="auto" w:fill="E5F5FF"/>
+          </w:tcPr>
+          <w:p>
+            <w:pPr>
+              <w:pStyle w:val="BDOITable"/>
+            </w:pPr>
+            <w:r>
+              <w:rPr>
+                <w:sz w:val="15"/>
+              </w:rPr>
+              <w:t>Interfaces, user access and menus, and the Technical Specification (a separate document); not the business screens</w:t>
+            </w:r>
+          </w:p>
+        </w:tc>
+        <w:tc>
+          <w:tcPr>
+            <w:tcW w:type="dxa" w:w="2040"/>
+            <w:tcMar>
+              <w:top w:w="50" w:type="dxa"/>
+              <w:bottom w:w="50" w:type="dxa"/>
+              <w:left w:w="90" w:type="dxa"/>
+              <w:right w:w="90" w:type="dxa"/>
+            </w:tcMar>
+            <w:shd w:val="clear" w:color="auto" w:fill="E5F5FF"/>
+          </w:tcPr>
+          <w:p>
+            <w:pPr>
+              <w:pStyle w:val="BDOITable"/>
+            </w:pPr>
+            <w:r>
+              <w:rPr>
+                <w:sz w:val="15"/>
+              </w:rPr>
+              <w:t>Added for this set</w:t>
+            </w:r>
+          </w:p>
+        </w:tc>
+      </w:tr>
+      <w:tr>
+        <w:tc>
+          <w:tcPr>
+            <w:tcW w:type="dxa" w:w="1246"/>
+            <w:tcMar>
+              <w:top w:w="50" w:type="dxa"/>
+              <w:bottom w:w="50" w:type="dxa"/>
+              <w:left w:w="90" w:type="dxa"/>
+              <w:right w:w="90" w:type="dxa"/>
+            </w:tcMar>
+          </w:tcPr>
+          <w:p>
+            <w:pPr>
+              <w:pStyle w:val="BDOITable"/>
+            </w:pPr>
+            <w:r>
+              <w:rPr>
+                <w:sz w:val="15"/>
+              </w:rPr>
+              <w:t>Approved by</w:t>
+            </w:r>
+          </w:p>
+        </w:tc>
+        <w:tc>
+          <w:tcPr>
+            <w:tcW w:type="dxa" w:w="2833"/>
+            <w:tcMar>
+              <w:top w:w="50" w:type="dxa"/>
+              <w:bottom w:w="50" w:type="dxa"/>
+              <w:left w:w="90" w:type="dxa"/>
+              <w:right w:w="90" w:type="dxa"/>
+            </w:tcMar>
+          </w:tcPr>
+          <w:p>
+            <w:pPr>
+              <w:pStyle w:val="BDOITable"/>
+            </w:pPr>
+            <w:r>
+              <w:rPr>
+                <w:sz w:val="15"/>
+              </w:rPr>
+              <w:t>Product Owner, Marketing Business System (BDOI)</w:t>
+            </w:r>
+          </w:p>
+        </w:tc>
+        <w:tc>
+          <w:tcPr>
+            <w:tcW w:type="dxa" w:w="3853"/>
+            <w:tcMar>
+              <w:top w:w="50" w:type="dxa"/>
+              <w:bottom w:w="50" w:type="dxa"/>
+              <w:left w:w="90" w:type="dxa"/>
+              <w:right w:w="90" w:type="dxa"/>
+            </w:tcMar>
+          </w:tcPr>
+          <w:p>
+            <w:pPr>
+              <w:pStyle w:val="BDOITable"/>
+            </w:pPr>
+            <w:r>
+              <w:rPr>
+                <w:sz w:val="15"/>
+              </w:rPr>
+              <w:t>Owns the set and approves all of its contents</w:t>
+            </w:r>
+          </w:p>
+        </w:tc>
+        <w:tc>
+          <w:tcPr>
+            <w:tcW w:type="dxa" w:w="2040"/>
+            <w:tcMar>
+              <w:top w:w="50" w:type="dxa"/>
+              <w:bottom w:w="50" w:type="dxa"/>
+              <w:left w:w="90" w:type="dxa"/>
+              <w:right w:w="90" w:type="dxa"/>
+            </w:tcMar>
+          </w:tcPr>
+          <w:p>
+            <w:pPr>
+              <w:pStyle w:val="BDOITable"/>
+            </w:pPr>
+            <w:r>
+              <w:rPr>
+                <w:sz w:val="15"/>
+              </w:rPr>
+              <w:t>Approved by (p.34, p.9)</w:t>
+            </w:r>
+          </w:p>
+        </w:tc>
+      </w:tr>
+      <w:tr>
+        <w:tc>
+          <w:tcPr>
+            <w:tcW w:type="dxa" w:w="1246"/>
+            <w:tcMar>
+              <w:top w:w="50" w:type="dxa"/>
+              <w:bottom w:w="50" w:type="dxa"/>
+              <w:left w:w="90" w:type="dxa"/>
+              <w:right w:w="90" w:type="dxa"/>
+            </w:tcMar>
+            <w:shd w:val="clear" w:color="auto" w:fill="E5F5FF"/>
+          </w:tcPr>
+          <w:p>
+            <w:pPr>
+              <w:pStyle w:val="BDOITable"/>
+            </w:pPr>
+            <w:r>
+              <w:rPr>
+                <w:sz w:val="15"/>
+              </w:rPr>
+              <w:t>Approved by</w:t>
+            </w:r>
+          </w:p>
+        </w:tc>
+        <w:tc>
+          <w:tcPr>
+            <w:tcW w:type="dxa" w:w="2833"/>
+            <w:tcMar>
+              <w:top w:w="50" w:type="dxa"/>
+              <w:bottom w:w="50" w:type="dxa"/>
+              <w:left w:w="90" w:type="dxa"/>
+              <w:right w:w="90" w:type="dxa"/>
+            </w:tcMar>
+            <w:shd w:val="clear" w:color="auto" w:fill="E5F5FF"/>
+          </w:tcPr>
+          <w:p>
+            <w:pPr>
+              <w:pStyle w:val="BDOITable"/>
+            </w:pPr>
+            <w:r>
+              <w:rPr>
+                <w:sz w:val="15"/>
+              </w:rPr>
+              <w:t>Unit Head - Claims, Analytics, Risk Management, Reinsurance and Technical Underwriting (BDOI)</w:t>
+            </w:r>
+          </w:p>
+        </w:tc>
+        <w:tc>
+          <w:tcPr>
+            <w:tcW w:type="dxa" w:w="3853"/>
+            <w:tcMar>
+              <w:top w:w="50" w:type="dxa"/>
+              <w:bottom w:w="50" w:type="dxa"/>
+              <w:left w:w="90" w:type="dxa"/>
+              <w:right w:w="90" w:type="dxa"/>
+            </w:tcMar>
+            <w:shd w:val="clear" w:color="auto" w:fill="E5F5FF"/>
+          </w:tcPr>
+          <w:p>
+            <w:pPr>
+              <w:pStyle w:val="BDOITable"/>
+            </w:pPr>
+            <w:r>
+              <w:rPr>
+                <w:sz w:val="15"/>
+              </w:rPr>
+              <w:t>The TSU part: package requests, negotiation, requirements, advisories and expiry</w:t>
+            </w:r>
+          </w:p>
+        </w:tc>
+        <w:tc>
+          <w:tcPr>
+            <w:tcW w:type="dxa" w:w="2040"/>
+            <w:tcMar>
+              <w:top w:w="50" w:type="dxa"/>
+              <w:bottom w:w="50" w:type="dxa"/>
+              <w:left w:w="90" w:type="dxa"/>
+              <w:right w:w="90" w:type="dxa"/>
+            </w:tcMar>
+            <w:shd w:val="clear" w:color="auto" w:fill="E5F5FF"/>
+          </w:tcPr>
+          <w:p>
+            <w:pPr>
+              <w:pStyle w:val="BDOITable"/>
+            </w:pPr>
+            <w:r>
+              <w:rPr>
+                <w:sz w:val="15"/>
+              </w:rPr>
+              <w:t>Approved by (p.35, p.9)</w:t>
+            </w:r>
+          </w:p>
+        </w:tc>
+      </w:tr>
+      <w:tr>
+        <w:tc>
+          <w:tcPr>
+            <w:tcW w:type="dxa" w:w="1246"/>
+            <w:tcMar>
+              <w:top w:w="50" w:type="dxa"/>
+              <w:bottom w:w="50" w:type="dxa"/>
+              <w:left w:w="90" w:type="dxa"/>
+              <w:right w:w="90" w:type="dxa"/>
+            </w:tcMar>
+          </w:tcPr>
+          <w:p>
+            <w:pPr>
+              <w:pStyle w:val="BDOITable"/>
+            </w:pPr>
+            <w:r>
+              <w:rPr>
+                <w:sz w:val="15"/>
+              </w:rPr>
+              <w:t>Approved by</w:t>
+            </w:r>
+          </w:p>
+        </w:tc>
+        <w:tc>
+          <w:tcPr>
+            <w:tcW w:type="dxa" w:w="2833"/>
+            <w:tcMar>
+              <w:top w:w="50" w:type="dxa"/>
+              <w:bottom w:w="50" w:type="dxa"/>
+              <w:left w:w="90" w:type="dxa"/>
+              <w:right w:w="90" w:type="dxa"/>
+            </w:tcMar>
+          </w:tcPr>
+          <w:p>
+            <w:pPr>
+              <w:pStyle w:val="BDOITable"/>
+            </w:pPr>
+            <w:r>
+              <w:rPr>
+                <w:sz w:val="15"/>
+              </w:rPr>
+              <w:t>Unit Head - Combank and Corbank (BDOI)</w:t>
+            </w:r>
+          </w:p>
+        </w:tc>
+        <w:tc>
+          <w:tcPr>
+            <w:tcW w:type="dxa" w:w="3853"/>
+            <w:tcMar>
+              <w:top w:w="50" w:type="dxa"/>
+              <w:bottom w:w="50" w:type="dxa"/>
+              <w:left w:w="90" w:type="dxa"/>
+              <w:right w:w="90" w:type="dxa"/>
+            </w:tcMar>
+          </w:tcPr>
+          <w:p>
+            <w:pPr>
+              <w:pStyle w:val="BDOITable"/>
+            </w:pPr>
+            <w:r>
+              <w:rPr>
+                <w:sz w:val="15"/>
+              </w:rPr>
+              <w:t>Package requests, approvals and pricing for Combank and Corbank</w:t>
+            </w:r>
+          </w:p>
+        </w:tc>
+        <w:tc>
+          <w:tcPr>
+            <w:tcW w:type="dxa" w:w="2040"/>
+            <w:tcMar>
+              <w:top w:w="50" w:type="dxa"/>
+              <w:bottom w:w="50" w:type="dxa"/>
+              <w:left w:w="90" w:type="dxa"/>
+              <w:right w:w="90" w:type="dxa"/>
+            </w:tcMar>
+          </w:tcPr>
+          <w:p>
+            <w:pPr>
+              <w:pStyle w:val="BDOITable"/>
+            </w:pPr>
+            <w:r>
+              <w:rPr>
+                <w:sz w:val="15"/>
+              </w:rPr>
+              <w:t>Approved by (p.35, p.9)</w:t>
+            </w:r>
+          </w:p>
+        </w:tc>
+      </w:tr>
+      <w:tr>
+        <w:tc>
+          <w:tcPr>
+            <w:tcW w:type="dxa" w:w="1246"/>
+            <w:tcMar>
+              <w:top w:w="50" w:type="dxa"/>
+              <w:bottom w:w="50" w:type="dxa"/>
+              <w:left w:w="90" w:type="dxa"/>
+              <w:right w:w="90" w:type="dxa"/>
+            </w:tcMar>
+            <w:shd w:val="clear" w:color="auto" w:fill="E5F5FF"/>
+          </w:tcPr>
+          <w:p>
+            <w:pPr>
+              <w:pStyle w:val="BDOITable"/>
+            </w:pPr>
+            <w:r>
+              <w:rPr>
+                <w:sz w:val="15"/>
+              </w:rPr>
+              <w:t>Approved by</w:t>
+            </w:r>
+          </w:p>
+        </w:tc>
+        <w:tc>
+          <w:tcPr>
+            <w:tcW w:type="dxa" w:w="2833"/>
+            <w:tcMar>
+              <w:top w:w="50" w:type="dxa"/>
+              <w:bottom w:w="50" w:type="dxa"/>
+              <w:left w:w="90" w:type="dxa"/>
+              <w:right w:w="90" w:type="dxa"/>
+            </w:tcMar>
+            <w:shd w:val="clear" w:color="auto" w:fill="E5F5FF"/>
+          </w:tcPr>
+          <w:p>
+            <w:pPr>
+              <w:pStyle w:val="BDOITable"/>
+            </w:pPr>
+            <w:r>
+              <w:rPr>
+                <w:sz w:val="15"/>
+              </w:rPr>
+              <w:t>Head - Retail Marketing (BDOI)</w:t>
+            </w:r>
+          </w:p>
+        </w:tc>
+        <w:tc>
+          <w:tcPr>
+            <w:tcW w:type="dxa" w:w="3853"/>
+            <w:tcMar>
+              <w:top w:w="50" w:type="dxa"/>
+              <w:bottom w:w="50" w:type="dxa"/>
+              <w:left w:w="90" w:type="dxa"/>
+              <w:right w:w="90" w:type="dxa"/>
+            </w:tcMar>
+            <w:shd w:val="clear" w:color="auto" w:fill="E5F5FF"/>
+          </w:tcPr>
+          <w:p>
+            <w:pPr>
+              <w:pStyle w:val="BDOITable"/>
+            </w:pPr>
+            <w:r>
+              <w:rPr>
+                <w:sz w:val="15"/>
+              </w:rPr>
+              <w:t>Package requests, approvals and pricing for Retail Marketing</w:t>
+            </w:r>
+          </w:p>
+        </w:tc>
+        <w:tc>
+          <w:tcPr>
+            <w:tcW w:type="dxa" w:w="2040"/>
+            <w:tcMar>
+              <w:top w:w="50" w:type="dxa"/>
+              <w:bottom w:w="50" w:type="dxa"/>
+              <w:left w:w="90" w:type="dxa"/>
+              <w:right w:w="90" w:type="dxa"/>
+            </w:tcMar>
+            <w:shd w:val="clear" w:color="auto" w:fill="E5F5FF"/>
+          </w:tcPr>
+          <w:p>
+            <w:pPr>
+              <w:pStyle w:val="BDOITable"/>
+            </w:pPr>
+            <w:r>
+              <w:rPr>
+                <w:sz w:val="15"/>
+              </w:rPr>
+              <w:t>Approved by (p.35, p.9)</w:t>
+            </w:r>
+          </w:p>
+        </w:tc>
+      </w:tr>
+      <w:tr>
+        <w:tc>
+          <w:tcPr>
+            <w:tcW w:type="dxa" w:w="1246"/>
+            <w:tcMar>
+              <w:top w:w="50" w:type="dxa"/>
+              <w:bottom w:w="50" w:type="dxa"/>
+              <w:left w:w="90" w:type="dxa"/>
+              <w:right w:w="90" w:type="dxa"/>
+            </w:tcMar>
+          </w:tcPr>
+          <w:p>
+            <w:pPr>
+              <w:pStyle w:val="BDOITable"/>
+            </w:pPr>
+            <w:r>
+              <w:rPr>
+                <w:sz w:val="15"/>
+              </w:rPr>
+              <w:t>Approved by</w:t>
+            </w:r>
+          </w:p>
+        </w:tc>
+        <w:tc>
+          <w:tcPr>
+            <w:tcW w:type="dxa" w:w="2833"/>
+            <w:tcMar>
+              <w:top w:w="50" w:type="dxa"/>
+              <w:bottom w:w="50" w:type="dxa"/>
+              <w:left w:w="90" w:type="dxa"/>
+              <w:right w:w="90" w:type="dxa"/>
+            </w:tcMar>
+          </w:tcPr>
+          <w:p>
+            <w:pPr>
+              <w:pStyle w:val="BDOITable"/>
+            </w:pPr>
+            <w:r>
+              <w:rPr>
+                <w:sz w:val="15"/>
+              </w:rPr>
+              <w:t>Head - Corporate and Retail Marketing (BDOI)</w:t>
+            </w:r>
+          </w:p>
+        </w:tc>
+        <w:tc>
+          <w:tcPr>
+            <w:tcW w:type="dxa" w:w="3853"/>
+            <w:tcMar>
+              <w:top w:w="50" w:type="dxa"/>
+              <w:bottom w:w="50" w:type="dxa"/>
+              <w:left w:w="90" w:type="dxa"/>
+              <w:right w:w="90" w:type="dxa"/>
+            </w:tcMar>
+          </w:tcPr>
+          <w:p>
+            <w:pPr>
+              <w:pStyle w:val="BDOITable"/>
+            </w:pPr>
+            <w:r>
+              <w:rPr>
+                <w:sz w:val="15"/>
+              </w:rPr>
+              <w:t>Package requests, approvals and pricing for Corporate Marketing</w:t>
+            </w:r>
+          </w:p>
+        </w:tc>
+        <w:tc>
+          <w:tcPr>
+            <w:tcW w:type="dxa" w:w="2040"/>
+            <w:tcMar>
+              <w:top w:w="50" w:type="dxa"/>
+              <w:bottom w:w="50" w:type="dxa"/>
+              <w:left w:w="90" w:type="dxa"/>
+              <w:right w:w="90" w:type="dxa"/>
+            </w:tcMar>
+          </w:tcPr>
+          <w:p>
+            <w:pPr>
+              <w:pStyle w:val="BDOITable"/>
+            </w:pPr>
+            <w:r>
+              <w:rPr>
+                <w:sz w:val="15"/>
+              </w:rPr>
+              <w:t>Approved by (p.35)</w:t>
+            </w:r>
+          </w:p>
+        </w:tc>
+      </w:tr>
+      <w:tr>
+        <w:tc>
+          <w:tcPr>
+            <w:tcW w:type="dxa" w:w="1246"/>
+            <w:tcMar>
+              <w:top w:w="50" w:type="dxa"/>
+              <w:bottom w:w="50" w:type="dxa"/>
+              <w:left w:w="90" w:type="dxa"/>
+              <w:right w:w="90" w:type="dxa"/>
+            </w:tcMar>
+            <w:shd w:val="clear" w:color="auto" w:fill="E5F5FF"/>
+          </w:tcPr>
+          <w:p>
+            <w:pPr>
+              <w:pStyle w:val="BDOITable"/>
+            </w:pPr>
+            <w:r>
+              <w:rPr>
+                <w:sz w:val="15"/>
+              </w:rPr>
+              <w:t>Approved by</w:t>
+            </w:r>
+          </w:p>
+        </w:tc>
+        <w:tc>
+          <w:tcPr>
+            <w:tcW w:type="dxa" w:w="2833"/>
+            <w:tcMar>
+              <w:top w:w="50" w:type="dxa"/>
+              <w:bottom w:w="50" w:type="dxa"/>
+              <w:left w:w="90" w:type="dxa"/>
+              <w:right w:w="90" w:type="dxa"/>
+            </w:tcMar>
+            <w:shd w:val="clear" w:color="auto" w:fill="E5F5FF"/>
+          </w:tcPr>
+          <w:p>
+            <w:pPr>
+              <w:pStyle w:val="BDOITable"/>
+            </w:pPr>
+            <w:r>
+              <w:rPr>
+                <w:sz w:val="15"/>
+              </w:rPr>
+              <w:t>Head - Comptrollership (BDOI)</w:t>
+            </w:r>
+          </w:p>
+        </w:tc>
+        <w:tc>
+          <w:tcPr>
+            <w:tcW w:type="dxa" w:w="3853"/>
+            <w:tcMar>
+              <w:top w:w="50" w:type="dxa"/>
+              <w:bottom w:w="50" w:type="dxa"/>
+              <w:left w:w="90" w:type="dxa"/>
+              <w:right w:w="90" w:type="dxa"/>
+            </w:tcMar>
+            <w:shd w:val="clear" w:color="auto" w:fill="E5F5FF"/>
+          </w:tcPr>
+          <w:p>
+            <w:pPr>
+              <w:pStyle w:val="BDOITable"/>
+            </w:pPr>
+            <w:r>
+              <w:rPr>
+                <w:sz w:val="15"/>
+              </w:rPr>
+              <w:t>Rates and taxes, commission rates and incentive criteria</w:t>
+            </w:r>
+          </w:p>
+        </w:tc>
+        <w:tc>
+          <w:tcPr>
+            <w:tcW w:type="dxa" w:w="2040"/>
+            <w:tcMar>
+              <w:top w:w="50" w:type="dxa"/>
+              <w:bottom w:w="50" w:type="dxa"/>
+              <w:left w:w="90" w:type="dxa"/>
+              <w:right w:w="90" w:type="dxa"/>
+            </w:tcMar>
+            <w:shd w:val="clear" w:color="auto" w:fill="E5F5FF"/>
+          </w:tcPr>
+          <w:p>
+            <w:pPr>
+              <w:pStyle w:val="BDOITable"/>
+            </w:pPr>
+            <w:r>
+              <w:rPr>
+                <w:sz w:val="15"/>
+              </w:rPr>
+              <w:t>Approved by (p.35; marked not required on the addendum, p.9)</w:t>
+            </w:r>
+          </w:p>
+        </w:tc>
+      </w:tr>
+    </w:tbl>
+    <w:p>
+      <w:pPr>
+        <w:pStyle w:val="BDOISpacer"/>
+      </w:pPr>
+    </w:p>
+    <w:p>
+      <w:r>
+        <w:rPr/>
+        <w:t>The signatories sign the Sign-off certificate sheet of the sign-off workbook in the same order: prepared by, input provided by, reviewed by, approved by.</w:t>
+      </w:r>
+    </w:p>
+    <w:p>
+      <w:pPr>
+        <w:pStyle w:val="Heading1"/>
+        <w:pBdr>
+          <w:bottom w:val="single" w:sz="4" w:space="4" w:color="99C1E7"/>
+        </w:pBdr>
+      </w:pPr>
+      <w:bookmarkStart w:id="106" w:name="_Toc000106"/>
+      <w:r>
+        <w:rPr/>
+        <w:t>6 Configuration inputs</w:t>
+      </w:r>
+      <w:bookmarkEnd w:id="106"/>
     </w:p>
     <w:p>
       <w:r>
@@ -4572,12 +7210,12 @@
           <w:bottom w:val="single" w:sz="4" w:space="4" w:color="99C1E7"/>
         </w:pBdr>
       </w:pPr>
-      <w:bookmarkStart w:id="106" w:name="_Toc000106"/>
+      <w:bookmarkStart w:id="107" w:name="_Toc000107"/>
       <w:r>
         <w:rPr/>
-        <w:t>6 Change control after sign-off</w:t>
+        <w:t>7 Change control after sign-off</w:t>
       </w:r>
-      <w:bookmarkEnd w:id="106"/>
+      <w:bookmarkEnd w:id="107"/>
     </w:p>
     <w:p>
       <w:r>

</xml_diff>

<commit_message>
Drop 0 sign-off sets v2.0 with the UX screen documents: 07 UX Screen Deck, 08 UX screen register and 09 image package of BRD-03, BRD-11 and BRD-13; FRS, handbook, sign-off and migration workbooks, Start Here and guide decks rebuilt on the retaken screenshots, with the UX documents in the map of the set and in who signs what; identical landing pages and menus kept once; drop closure and drop index rebuilt
</commit_message>
<xml_diff>
--- a/docs/deliverables/out/Drop-0_Setup_and_Data_Migration/BRD-03_Product_Maintenance/00_BIBS_StartHere_BRD-03_Product_Maintenance_v2.0.docx
+++ b/docs/deliverables/out/Drop-0_Setup_and_Data_Migration/BRD-03_Product_Maintenance/00_BIBS_StartHere_BRD-03_Product_Maintenance_v2.0.docx
@@ -1634,7 +1634,7 @@
           <w:t xml:space="preserve">	</w:t>
         </w:r>
         <w:r>
-          <w:t xml:space="preserve">4</w:t>
+          <w:t xml:space="preserve">5</w:t>
         </w:r>
       </w:hyperlink>
     </w:p>
@@ -1682,7 +1682,7 @@
           <w:t xml:space="preserve">	</w:t>
         </w:r>
         <w:r>
-          <w:t xml:space="preserve">7</w:t>
+          <w:t xml:space="preserve">8</w:t>
         </w:r>
       </w:hyperlink>
     </w:p>
@@ -2537,6 +2537,284 @@
           </w:p>
         </w:tc>
       </w:tr>
+      <w:tr>
+        <w:tc>
+          <w:tcPr>
+            <w:tcW w:type="dxa" w:w="2946"/>
+            <w:tcMar>
+              <w:top w:w="50" w:type="dxa"/>
+              <w:bottom w:w="50" w:type="dxa"/>
+              <w:left w:w="90" w:type="dxa"/>
+              <w:right w:w="90" w:type="dxa"/>
+            </w:tcMar>
+            <w:shd w:val="clear" w:color="auto" w:fill="E5F5FF"/>
+          </w:tcPr>
+          <w:p>
+            <w:pPr>
+              <w:pStyle w:val="BDOITable"/>
+            </w:pPr>
+            <w:r>
+              <w:rPr>
+                <w:sz w:val="15"/>
+              </w:rPr>
+              <w:t>07_BIBS_UXDeck_BRD-03_Product_Maintenance_v2.0.pptx</w:t>
+            </w:r>
+          </w:p>
+        </w:tc>
+        <w:tc>
+          <w:tcPr>
+            <w:tcW w:type="dxa" w:w="3626"/>
+            <w:tcMar>
+              <w:top w:w="50" w:type="dxa"/>
+              <w:bottom w:w="50" w:type="dxa"/>
+              <w:left w:w="90" w:type="dxa"/>
+              <w:right w:w="90" w:type="dxa"/>
+            </w:tcMar>
+            <w:shd w:val="clear" w:color="auto" w:fill="E5F5FF"/>
+          </w:tcPr>
+          <w:p>
+            <w:pPr>
+              <w:pStyle w:val="BDOITable"/>
+            </w:pPr>
+            <w:r>
+              <w:rPr>
+                <w:sz w:val="15"/>
+              </w:rPr>
+              <w:t>UX Screen Deck for the BDOI UX Design team: design foundation, navigation and personas, every flow step by step and every screen with all its states</w:t>
+            </w:r>
+          </w:p>
+        </w:tc>
+        <w:tc>
+          <w:tcPr>
+            <w:tcW w:type="dxa" w:w="1926"/>
+            <w:tcMar>
+              <w:top w:w="50" w:type="dxa"/>
+              <w:bottom w:w="50" w:type="dxa"/>
+              <w:left w:w="90" w:type="dxa"/>
+              <w:right w:w="90" w:type="dxa"/>
+            </w:tcMar>
+            <w:shd w:val="clear" w:color="auto" w:fill="E5F5FF"/>
+          </w:tcPr>
+          <w:p>
+            <w:pPr>
+              <w:pStyle w:val="BDOITable"/>
+            </w:pPr>
+            <w:r>
+              <w:rPr>
+                <w:sz w:val="15"/>
+              </w:rPr>
+              <w:t>BDOI UX Design team</w:t>
+            </w:r>
+          </w:p>
+        </w:tc>
+        <w:tc>
+          <w:tcPr>
+            <w:tcW w:type="dxa" w:w="1473"/>
+            <w:tcMar>
+              <w:top w:w="50" w:type="dxa"/>
+              <w:bottom w:w="50" w:type="dxa"/>
+              <w:left w:w="90" w:type="dxa"/>
+              <w:right w:w="90" w:type="dxa"/>
+            </w:tcMar>
+            <w:shd w:val="clear" w:color="auto" w:fill="E5F5FF"/>
+          </w:tcPr>
+          <w:p>
+            <w:pPr>
+              <w:pStyle w:val="BDOITable"/>
+            </w:pPr>
+            <w:r>
+              <w:rPr>
+                <w:sz w:val="15"/>
+              </w:rPr>
+              <w:t>From the issue, in parallel with the review; re-issued with each version of the set</w:t>
+            </w:r>
+          </w:p>
+        </w:tc>
+      </w:tr>
+      <w:tr>
+        <w:tc>
+          <w:tcPr>
+            <w:tcW w:type="dxa" w:w="2946"/>
+            <w:tcMar>
+              <w:top w:w="50" w:type="dxa"/>
+              <w:bottom w:w="50" w:type="dxa"/>
+              <w:left w:w="90" w:type="dxa"/>
+              <w:right w:w="90" w:type="dxa"/>
+            </w:tcMar>
+          </w:tcPr>
+          <w:p>
+            <w:pPr>
+              <w:pStyle w:val="BDOITable"/>
+            </w:pPr>
+            <w:r>
+              <w:rPr>
+                <w:sz w:val="15"/>
+              </w:rPr>
+              <w:t>08_BIBS_UXScreens_BRD-03_Product_Maintenance_v2.0.xlsx</w:t>
+            </w:r>
+          </w:p>
+        </w:tc>
+        <w:tc>
+          <w:tcPr>
+            <w:tcW w:type="dxa" w:w="3626"/>
+            <w:tcMar>
+              <w:top w:w="50" w:type="dxa"/>
+              <w:bottom w:w="50" w:type="dxa"/>
+              <w:left w:w="90" w:type="dxa"/>
+              <w:right w:w="90" w:type="dxa"/>
+            </w:tcMar>
+          </w:tcPr>
+          <w:p>
+            <w:pPr>
+              <w:pStyle w:val="BDOITable"/>
+            </w:pPr>
+            <w:r>
+              <w:rPr>
+                <w:sz w:val="15"/>
+              </w:rPr>
+              <w:t>UX screen register: one row per screen image with the screen, personas, flow and step, state, FRS section and requirements, UXD status and comments, and the Changed in this issue flag</w:t>
+            </w:r>
+          </w:p>
+        </w:tc>
+        <w:tc>
+          <w:tcPr>
+            <w:tcW w:type="dxa" w:w="1926"/>
+            <w:tcMar>
+              <w:top w:w="50" w:type="dxa"/>
+              <w:bottom w:w="50" w:type="dxa"/>
+              <w:left w:w="90" w:type="dxa"/>
+              <w:right w:w="90" w:type="dxa"/>
+            </w:tcMar>
+          </w:tcPr>
+          <w:p>
+            <w:pPr>
+              <w:pStyle w:val="BDOITable"/>
+            </w:pPr>
+            <w:r>
+              <w:rPr>
+                <w:sz w:val="15"/>
+              </w:rPr>
+              <w:t>BDOI UX Design team</w:t>
+            </w:r>
+          </w:p>
+        </w:tc>
+        <w:tc>
+          <w:tcPr>
+            <w:tcW w:type="dxa" w:w="1473"/>
+            <w:tcMar>
+              <w:top w:w="50" w:type="dxa"/>
+              <w:bottom w:w="50" w:type="dxa"/>
+              <w:left w:w="90" w:type="dxa"/>
+              <w:right w:w="90" w:type="dxa"/>
+            </w:tcMar>
+          </w:tcPr>
+          <w:p>
+            <w:pPr>
+              <w:pStyle w:val="BDOITable"/>
+            </w:pPr>
+            <w:r>
+              <w:rPr>
+                <w:sz w:val="15"/>
+              </w:rPr>
+              <w:t>Kept by the UX Design team; the changed rows are flagged at each issue</w:t>
+            </w:r>
+          </w:p>
+        </w:tc>
+      </w:tr>
+      <w:tr>
+        <w:tc>
+          <w:tcPr>
+            <w:tcW w:type="dxa" w:w="2946"/>
+            <w:tcMar>
+              <w:top w:w="50" w:type="dxa"/>
+              <w:bottom w:w="50" w:type="dxa"/>
+              <w:left w:w="90" w:type="dxa"/>
+              <w:right w:w="90" w:type="dxa"/>
+            </w:tcMar>
+            <w:shd w:val="clear" w:color="auto" w:fill="E5F5FF"/>
+          </w:tcPr>
+          <w:p>
+            <w:pPr>
+              <w:pStyle w:val="BDOITable"/>
+            </w:pPr>
+            <w:r>
+              <w:rPr>
+                <w:sz w:val="15"/>
+              </w:rPr>
+              <w:t>09_BIBS_UXScreens_BRD-03_Product_Maintenance_v2.0.zip</w:t>
+            </w:r>
+          </w:p>
+        </w:tc>
+        <w:tc>
+          <w:tcPr>
+            <w:tcW w:type="dxa" w:w="3626"/>
+            <w:tcMar>
+              <w:top w:w="50" w:type="dxa"/>
+              <w:bottom w:w="50" w:type="dxa"/>
+              <w:left w:w="90" w:type="dxa"/>
+              <w:right w:w="90" w:type="dxa"/>
+            </w:tcMar>
+            <w:shd w:val="clear" w:color="auto" w:fill="E5F5FF"/>
+          </w:tcPr>
+          <w:p>
+            <w:pPr>
+              <w:pStyle w:val="BDOITable"/>
+            </w:pPr>
+            <w:r>
+              <w:rPr>
+                <w:sz w:val="15"/>
+              </w:rPr>
+              <w:t>Image package: every screen image at twice the screen resolution (PNG), the component crops and the register as CSV</w:t>
+            </w:r>
+          </w:p>
+        </w:tc>
+        <w:tc>
+          <w:tcPr>
+            <w:tcW w:type="dxa" w:w="1926"/>
+            <w:tcMar>
+              <w:top w:w="50" w:type="dxa"/>
+              <w:bottom w:w="50" w:type="dxa"/>
+              <w:left w:w="90" w:type="dxa"/>
+              <w:right w:w="90" w:type="dxa"/>
+            </w:tcMar>
+            <w:shd w:val="clear" w:color="auto" w:fill="E5F5FF"/>
+          </w:tcPr>
+          <w:p>
+            <w:pPr>
+              <w:pStyle w:val="BDOITable"/>
+            </w:pPr>
+            <w:r>
+              <w:rPr>
+                <w:sz w:val="15"/>
+              </w:rPr>
+              <w:t>BDOI UX Design team</w:t>
+            </w:r>
+          </w:p>
+        </w:tc>
+        <w:tc>
+          <w:tcPr>
+            <w:tcW w:type="dxa" w:w="1473"/>
+            <w:tcMar>
+              <w:top w:w="50" w:type="dxa"/>
+              <w:bottom w:w="50" w:type="dxa"/>
+              <w:left w:w="90" w:type="dxa"/>
+              <w:right w:w="90" w:type="dxa"/>
+            </w:tcMar>
+            <w:shd w:val="clear" w:color="auto" w:fill="E5F5FF"/>
+          </w:tcPr>
+          <w:p>
+            <w:pPr>
+              <w:pStyle w:val="BDOITable"/>
+            </w:pPr>
+            <w:r>
+              <w:rPr>
+                <w:sz w:val="15"/>
+              </w:rPr>
+              <w:t>Imported into the design tool at each issue</w:t>
+            </w:r>
+          </w:p>
+        </w:tc>
+      </w:tr>
     </w:tbl>
     <w:p>
       <w:pPr>
@@ -2960,6 +3238,54 @@
                 <w:b/>
                 <w:sz w:val="16"/>
               </w:rPr>
+              <w:t>BDOI UX Design team</w:t>
+            </w:r>
+          </w:p>
+        </w:tc>
+        <w:tc>
+          <w:tcPr>
+            <w:tcW w:type="dxa" w:w="7592"/>
+            <w:tcMar>
+              <w:top w:w="50" w:type="dxa"/>
+              <w:bottom w:w="50" w:type="dxa"/>
+              <w:left w:w="90" w:type="dxa"/>
+              <w:right w:w="90" w:type="dxa"/>
+            </w:tcMar>
+          </w:tcPr>
+          <w:p>
+            <w:pPr>
+              <w:pStyle w:val="BDOITable"/>
+            </w:pPr>
+            <w:r>
+              <w:rPr>
+                <w:sz w:val="16"/>
+              </w:rPr>
+              <w:t>07 UX Screen Deck: design foundation and navigation first, then the personas, flows and screens of the design work; 08 UX screen register (filter Changed in this issue at each new issue); 09 image package in the design tool</w:t>
+            </w:r>
+          </w:p>
+        </w:tc>
+      </w:tr>
+      <w:tr>
+        <w:tc>
+          <w:tcPr>
+            <w:tcW w:type="dxa" w:w="2380"/>
+            <w:tcMar>
+              <w:top w:w="50" w:type="dxa"/>
+              <w:bottom w:w="50" w:type="dxa"/>
+              <w:left w:w="90" w:type="dxa"/>
+              <w:right w:w="90" w:type="dxa"/>
+            </w:tcMar>
+            <w:shd w:val="clear" w:color="auto" w:fill="E5F5FF"/>
+          </w:tcPr>
+          <w:p>
+            <w:pPr>
+              <w:pStyle w:val="BDOITable"/>
+            </w:pPr>
+            <w:r>
+              <w:rPr>
+                <w:b/>
+                <w:sz w:val="16"/>
+              </w:rPr>
               <w:t>iorta TechNXT project team</w:t>
             </w:r>
           </w:p>
@@ -2973,6 +3299,7 @@
               <w:left w:w="90" w:type="dxa"/>
               <w:right w:w="90" w:type="dxa"/>
             </w:tcMar>
+            <w:shd w:val="clear" w:color="auto" w:fill="E5F5FF"/>
           </w:tcPr>
           <w:p>
             <w:pPr>
@@ -5353,7 +5680,7 @@
                 <w:b/>
                 <w:sz w:val="15"/>
               </w:rPr>
-              <w:t>Proposed business rules and clarifications for confirmation</w:t>
+              <w:t>UX screen deck, UX screen register and image package (07 to 09, for the BDOI UX Design team; the screens as specified in this set)</w:t>
             </w:r>
           </w:p>
         </w:tc>
@@ -5399,7 +5726,7 @@
               <w:rPr>
                 <w:sz w:val="15"/>
               </w:rPr>
-              <w:t>BA (BPS), MBS, TSU</w:t>
+              <w:t>TSU, MBS</w:t>
             </w:r>
           </w:p>
         </w:tc>
@@ -5470,7 +5797,7 @@
                 <w:b/>
                 <w:sz w:val="15"/>
               </w:rPr>
-              <w:t>Interfaces, user access and menus by persona</w:t>
+              <w:t>Proposed business rules and clarifications for confirmation</w:t>
             </w:r>
           </w:p>
         </w:tc>
@@ -5514,7 +5841,7 @@
               <w:rPr>
                 <w:sz w:val="15"/>
               </w:rPr>
-              <w:t>MBS</w:t>
+              <w:t>BA (BPS), MBS, TSU</w:t>
             </w:r>
           </w:p>
         </w:tc>
@@ -5536,7 +5863,7 @@
               <w:rPr>
                 <w:sz w:val="15"/>
               </w:rPr>
-              <w:t>BDOI IT</w:t>
+              <w:t>Program Manager (BPS)</w:t>
             </w:r>
           </w:p>
         </w:tc>
@@ -5584,7 +5911,7 @@
                 <w:b/>
                 <w:sz w:val="15"/>
               </w:rPr>
-              <w:t>Test plan (04 workbook, 05 summary)</w:t>
+              <w:t>Interfaces, user access and menus by persona</w:t>
             </w:r>
           </w:p>
         </w:tc>
@@ -5630,7 +5957,7 @@
               <w:rPr>
                 <w:sz w:val="15"/>
               </w:rPr>
-              <w:t>TSU, MBS</w:t>
+              <w:t>MBS</w:t>
             </w:r>
           </w:p>
         </w:tc>
@@ -5653,7 +5980,7 @@
               <w:rPr>
                 <w:sz w:val="15"/>
               </w:rPr>
-              <w:t>Program Manager (BPS), BDOI IT</w:t>
+              <w:t>BDOI IT</w:t>
             </w:r>
           </w:p>
         </w:tc>
@@ -5701,7 +6028,7 @@
                 <w:b/>
                 <w:sz w:val="15"/>
               </w:rPr>
-              <w:t>Configuration inputs (06 templates, Drop 0)</w:t>
+              <w:t>Test plan (04 workbook, 05 summary)</w:t>
             </w:r>
           </w:p>
         </w:tc>
@@ -5745,7 +6072,7 @@
               <w:rPr>
                 <w:sz w:val="15"/>
               </w:rPr>
-              <w:t>MBS, TSU</w:t>
+              <w:t>TSU, MBS</w:t>
             </w:r>
           </w:p>
         </w:tc>
@@ -5767,7 +6094,7 @@
               <w:rPr>
                 <w:sz w:val="15"/>
               </w:rPr>
-              <w:t>MBS, Program Manager (BPS)</w:t>
+              <w:t>Program Manager (BPS), BDOI IT</w:t>
             </w:r>
           </w:p>
         </w:tc>
@@ -5789,7 +6116,7 @@
               <w:rPr>
                 <w:sz w:val="15"/>
               </w:rPr>
-              <w:t>Product Owner, Head Comptrollership</w:t>
+              <w:t>Product Owner</w:t>
             </w:r>
           </w:p>
         </w:tc>
@@ -5815,7 +6142,7 @@
                 <w:b/>
                 <w:sz w:val="15"/>
               </w:rPr>
-              <w:t>Technical Specification (separate document, not part of the business sign-off)</w:t>
+              <w:t>Configuration inputs (06 templates, Drop 0)</w:t>
             </w:r>
           </w:p>
         </w:tc>
@@ -5861,7 +6188,7 @@
               <w:rPr>
                 <w:sz w:val="15"/>
               </w:rPr>
-              <w:t>BDOI IT</w:t>
+              <w:t>MBS, TSU</w:t>
             </w:r>
           </w:p>
         </w:tc>
@@ -5884,6 +6211,120 @@
               <w:rPr>
                 <w:sz w:val="15"/>
               </w:rPr>
+              <w:t>MBS, Program Manager (BPS)</w:t>
+            </w:r>
+          </w:p>
+        </w:tc>
+        <w:tc>
+          <w:tcPr>
+            <w:tcW w:type="dxa" w:w="2153"/>
+            <w:tcMar>
+              <w:top w:w="50" w:type="dxa"/>
+              <w:bottom w:w="50" w:type="dxa"/>
+              <w:left w:w="90" w:type="dxa"/>
+              <w:right w:w="90" w:type="dxa"/>
+            </w:tcMar>
+            <w:shd w:val="clear" w:color="auto" w:fill="E5F5FF"/>
+          </w:tcPr>
+          <w:p>
+            <w:pPr>
+              <w:pStyle w:val="BDOITable"/>
+            </w:pPr>
+            <w:r>
+              <w:rPr>
+                <w:sz w:val="15"/>
+              </w:rPr>
+              <w:t>Product Owner, Head Comptrollership</w:t>
+            </w:r>
+          </w:p>
+        </w:tc>
+      </w:tr>
+      <w:tr>
+        <w:tc>
+          <w:tcPr>
+            <w:tcW w:type="dxa" w:w="2946"/>
+            <w:tcMar>
+              <w:top w:w="50" w:type="dxa"/>
+              <w:bottom w:w="50" w:type="dxa"/>
+              <w:left w:w="90" w:type="dxa"/>
+              <w:right w:w="90" w:type="dxa"/>
+            </w:tcMar>
+          </w:tcPr>
+          <w:p>
+            <w:pPr>
+              <w:pStyle w:val="BDOITable"/>
+            </w:pPr>
+            <w:r>
+              <w:rPr>
+                <w:b/>
+                <w:sz w:val="15"/>
+              </w:rPr>
+              <w:t>Technical Specification (separate document, not part of the business sign-off)</w:t>
+            </w:r>
+          </w:p>
+        </w:tc>
+        <w:tc>
+          <w:tcPr>
+            <w:tcW w:type="dxa" w:w="1360"/>
+            <w:tcMar>
+              <w:top w:w="50" w:type="dxa"/>
+              <w:bottom w:w="50" w:type="dxa"/>
+              <w:left w:w="90" w:type="dxa"/>
+              <w:right w:w="90" w:type="dxa"/>
+            </w:tcMar>
+          </w:tcPr>
+          <w:p>
+            <w:pPr>
+              <w:pStyle w:val="BDOITable"/>
+            </w:pPr>
+            <w:r>
+              <w:rPr>
+                <w:sz w:val="15"/>
+              </w:rPr>
+              <w:t>iorta TechNXT</w:t>
+            </w:r>
+          </w:p>
+        </w:tc>
+        <w:tc>
+          <w:tcPr>
+            <w:tcW w:type="dxa" w:w="1813"/>
+            <w:tcMar>
+              <w:top w:w="50" w:type="dxa"/>
+              <w:bottom w:w="50" w:type="dxa"/>
+              <w:left w:w="90" w:type="dxa"/>
+              <w:right w:w="90" w:type="dxa"/>
+            </w:tcMar>
+          </w:tcPr>
+          <w:p>
+            <w:pPr>
+              <w:pStyle w:val="BDOITable"/>
+            </w:pPr>
+            <w:r>
+              <w:rPr>
+                <w:sz w:val="15"/>
+              </w:rPr>
+              <w:t>BDOI IT</w:t>
+            </w:r>
+          </w:p>
+        </w:tc>
+        <w:tc>
+          <w:tcPr>
+            <w:tcW w:type="dxa" w:w="1700"/>
+            <w:tcMar>
+              <w:top w:w="50" w:type="dxa"/>
+              <w:bottom w:w="50" w:type="dxa"/>
+              <w:left w:w="90" w:type="dxa"/>
+              <w:right w:w="90" w:type="dxa"/>
+            </w:tcMar>
+          </w:tcPr>
+          <w:p>
+            <w:pPr>
+              <w:pStyle w:val="BDOITable"/>
+            </w:pPr>
+            <w:r>
+              <w:rPr>
+                <w:sz w:val="15"/>
+              </w:rPr>
               <w:t>BDOI IT</w:t>
             </w:r>
           </w:p>
@@ -5897,7 +6338,6 @@
               <w:left w:w="90" w:type="dxa"/>
               <w:right w:w="90" w:type="dxa"/>
             </w:tcMar>
-            <w:shd w:val="clear" w:color="auto" w:fill="E5F5FF"/>
           </w:tcPr>
           <w:p>
             <w:pPr>

</xml_diff>

<commit_message>
Drop 0 sign-off sets BRD-03, BRD-11 and BRD-13 rebuilt on screenshots retaken on a fresh seed stack: issue 2.1 changes CHG-PM-2.1-01 to 05, CHG-UA-2.1-01 to 05 and CHG-DM-2.1-01 to 05 flagged in the UX documents; 00 to 09 of each set, the Drop 0 closure set and the drop indexes rebuilt with both logos; password steps of the BRD-11 walkthrough cropped to the password card; the closure asks for no parameter of the insurer suite and claims the seeded tax codes
</commit_message>
<xml_diff>
--- a/docs/deliverables/out/Drop-0_Setup_and_Data_Migration/BRD-03_Product_Maintenance/00_BIBS_StartHere_BRD-03_Product_Maintenance_v2.0.docx
+++ b/docs/deliverables/out/Drop-0_Setup_and_Data_Migration/BRD-03_Product_Maintenance/00_BIBS_StartHere_BRD-03_Product_Maintenance_v2.0.docx
@@ -18,7 +18,7 @@
               <a:graphicData uri="http://schemas.openxmlformats.org/drawingml/2006/picture">
                 <pic:pic>
                   <pic:nvPicPr>
-                    <pic:cNvPr id="0" name="bdo-insure.png"/>
+                    <pic:cNvPr id="0" name="client-logo.png"/>
                     <pic:cNvPicPr/>
                   </pic:nvPicPr>
                   <pic:blipFill>
@@ -7848,7 +7848,7 @@
             <a:graphicData uri="http://schemas.openxmlformats.org/drawingml/2006/picture">
               <pic:pic>
                 <pic:nvPicPr>
-                  <pic:cNvPr id="0" name="bdo-insure.png"/>
+                  <pic:cNvPr id="0" name="client-logo.png"/>
                   <pic:cNvPicPr/>
                 </pic:nvPicPr>
                 <pic:blipFill>

</xml_diff>